<commit_message>
Update docs: Beatwave and EK diagram
</commit_message>
<xml_diff>
--- a/docs/Beatwave.docx
+++ b/docs/Beatwave.docx
@@ -3,141 +3,3084 @@
 <w:document xmlns:wpc="http://schemas.microsoft.com/office/word/2010/wordprocessingCanvas" xmlns:cx="http://schemas.microsoft.com/office/drawing/2014/chartex" xmlns:cx1="http://schemas.microsoft.com/office/drawing/2015/9/8/chartex" xmlns:cx2="http://schemas.microsoft.com/office/drawing/2015/10/21/chartex" xmlns:cx3="http://schemas.microsoft.com/office/drawing/2016/5/9/chartex" xmlns:cx4="http://schemas.microsoft.com/office/drawing/2016/5/10/chartex" xmlns:cx5="http://schemas.microsoft.com/office/drawing/2016/5/11/chartex" xmlns:cx6="http://schemas.microsoft.com/office/drawing/2016/5/12/chartex" xmlns:cx7="http://schemas.microsoft.com/office/drawing/2016/5/13/chartex" xmlns:cx8="http://schemas.microsoft.com/office/drawing/2016/5/14/chartex" xmlns:mc="http://schemas.openxmlformats.org/markup-compatibility/2006" xmlns:aink="http://schemas.microsoft.com/office/drawing/2016/ink" xmlns:am3d="http://schemas.microsoft.com/office/drawing/2017/model3d" xmlns:o="urn:schemas-microsoft-com:office:office" xmlns:oel="http://schemas.microsoft.com/office/2019/extlst" xmlns:r="http://schemas.openxmlformats.org/officeDocument/2006/relationships" xmlns:m="http://schemas.openxmlformats.org/officeDocument/2006/math" xmlns:v="urn:schemas-microsoft-com:vml" xmlns:wp14="http://schemas.microsoft.com/office/word/2010/wordprocessingDrawing" xmlns:wp="http://schemas.openxmlformats.org/drawingml/2006/wordprocessingDrawing" xmlns:w10="urn:schemas-microsoft-com:office:word" xmlns:w="http://schemas.openxmlformats.org/wordprocessingml/2006/main" xmlns:w14="http://schemas.microsoft.com/office/word/2010/wordml" xmlns:w15="http://schemas.microsoft.com/office/word/2012/wordml" xmlns:w16cex="http://schemas.microsoft.com/office/word/2018/wordml/cex" xmlns:w16cid="http://schemas.microsoft.com/office/word/2016/wordml/cid" xmlns:w16="http://schemas.microsoft.com/office/word/2018/wordml" xmlns:w16du="http://schemas.microsoft.com/office/word/2023/wordml/word16du" xmlns:w16sdtdh="http://schemas.microsoft.com/office/word/2020/wordml/sdtdatahash" xmlns:w16sdtfl="http://schemas.microsoft.com/office/word/2024/wordml/sdtformatlock" xmlns:w16se="http://schemas.microsoft.com/office/word/2015/wordml/symex" xmlns:wpg="http://schemas.microsoft.com/office/word/2010/wordprocessingGroup" xmlns:wpi="http://schemas.microsoft.com/office/word/2010/wordprocessingInk" xmlns:wne="http://schemas.microsoft.com/office/word/2006/wordml" xmlns:wps="http://schemas.microsoft.com/office/word/2010/wordprocessingShape" mc:Ignorable="w14 w15 w16se w16cid w16 w16cex w16sdtdh w16sdtfl w16du wp14">
   <w:body>
     <w:p>
-      <w:pPr>
-        <w:jc w:val="center"/>
+      <w:r>
+        <w:tab/>
+      </w:r>
+    </w:p>
+    <w:sdt>
+      <w:sdtPr>
+        <w:id w:val="1326936110"/>
+        <w:docPartObj>
+          <w:docPartGallery w:val="Cover Pages"/>
+          <w:docPartUnique/>
+        </w:docPartObj>
+      </w:sdtPr>
+      <w:sdtContent>
+        <w:p/>
+        <w:tbl>
+          <w:tblPr>
+            <w:tblpPr w:leftFromText="187" w:rightFromText="187" w:horzAnchor="margin" w:tblpXSpec="center" w:tblpYSpec="bottom"/>
+            <w:tblW w:w="3857" w:type="pct"/>
+            <w:tblLook w:val="04A0" w:firstRow="1" w:lastRow="0" w:firstColumn="1" w:lastColumn="0" w:noHBand="0" w:noVBand="1"/>
+          </w:tblPr>
+          <w:tblGrid>
+            <w:gridCol w:w="7176"/>
+          </w:tblGrid>
+          <w:tr>
+            <w:tc>
+              <w:tcPr>
+                <w:tcW w:w="7176" w:type="dxa"/>
+                <w:tcMar>
+                  <w:top w:w="216" w:type="dxa"/>
+                  <w:left w:w="115" w:type="dxa"/>
+                  <w:bottom w:w="216" w:type="dxa"/>
+                  <w:right w:w="115" w:type="dxa"/>
+                </w:tcMar>
+              </w:tcPr>
+              <w:sdt>
+                <w:sdtPr>
+                  <w:rPr>
+                    <w:color w:val="156082" w:themeColor="accent1"/>
+                    <w:sz w:val="28"/>
+                    <w:szCs w:val="28"/>
+                  </w:rPr>
+                  <w:alias w:val="Szerző"/>
+                  <w:id w:val="13406928"/>
+                  <w:placeholder>
+                    <w:docPart w:val="6232899E18244AF2B86370339A01C215"/>
+                  </w:placeholder>
+                  <w:dataBinding w:prefixMappings="xmlns:ns0='http://schemas.openxmlformats.org/package/2006/metadata/core-properties' xmlns:ns1='http://purl.org/dc/elements/1.1/'" w:xpath="/ns0:coreProperties[1]/ns1:creator[1]" w:storeItemID="{6C3C8BC8-F283-45AE-878A-BAB7291924A1}"/>
+                  <w:text/>
+                </w:sdtPr>
+                <w:sdtContent>
+                  <w:p>
+                    <w:pPr>
+                      <w:pStyle w:val="Nincstrkz"/>
+                      <w:rPr>
+                        <w:color w:val="156082" w:themeColor="accent1"/>
+                        <w:sz w:val="28"/>
+                        <w:szCs w:val="28"/>
+                      </w:rPr>
+                    </w:pPr>
+                    <w:r>
+                      <w:rPr>
+                        <w:color w:val="156082" w:themeColor="accent1"/>
+                        <w:sz w:val="28"/>
+                        <w:szCs w:val="28"/>
+                      </w:rPr>
+                      <w:t>Fabó Dudás Róbert</w:t>
+                    </w:r>
+                    <w:r>
+                      <w:rPr>
+                        <w:color w:val="156082" w:themeColor="accent1"/>
+                        <w:sz w:val="28"/>
+                        <w:szCs w:val="28"/>
+                      </w:rPr>
+                      <w:t>, Muzsik Csilla</w:t>
+                    </w:r>
+                  </w:p>
+                </w:sdtContent>
+              </w:sdt>
+              <w:p>
+                <w:pPr>
+                  <w:pStyle w:val="Nincstrkz"/>
+                  <w:rPr>
+                    <w:color w:val="156082" w:themeColor="accent1"/>
+                  </w:rPr>
+                </w:pPr>
+              </w:p>
+            </w:tc>
+          </w:tr>
+        </w:tbl>
+        <w:tbl>
+          <w:tblPr>
+            <w:tblpPr w:leftFromText="187" w:rightFromText="187" w:vertAnchor="page" w:horzAnchor="margin" w:tblpXSpec="center" w:tblpY="2817"/>
+            <w:tblW w:w="4000" w:type="pct"/>
+            <w:tblBorders>
+              <w:left w:val="single" w:sz="12" w:space="0" w:color="156082" w:themeColor="accent1"/>
+            </w:tblBorders>
+            <w:tblCellMar>
+              <w:left w:w="144" w:type="dxa"/>
+              <w:right w:w="115" w:type="dxa"/>
+            </w:tblCellMar>
+            <w:tblLook w:val="04A0" w:firstRow="1" w:lastRow="0" w:firstColumn="1" w:lastColumn="0" w:noHBand="0" w:noVBand="1"/>
+          </w:tblPr>
+          <w:tblGrid>
+            <w:gridCol w:w="7442"/>
+          </w:tblGrid>
+          <w:tr>
+            <w:tc>
+              <w:tcPr>
+                <w:tcW w:w="7442" w:type="dxa"/>
+                <w:tcMar>
+                  <w:top w:w="216" w:type="dxa"/>
+                  <w:left w:w="115" w:type="dxa"/>
+                  <w:bottom w:w="216" w:type="dxa"/>
+                  <w:right w:w="115" w:type="dxa"/>
+                </w:tcMar>
+              </w:tcPr>
+              <w:p>
+                <w:pPr>
+                  <w:pStyle w:val="Nincstrkz"/>
+                  <w:rPr>
+                    <w:color w:val="0F4761" w:themeColor="accent1" w:themeShade="BF"/>
+                    <w:sz w:val="24"/>
+                  </w:rPr>
+                </w:pPr>
+              </w:p>
+            </w:tc>
+          </w:tr>
+          <w:tr>
+            <w:tc>
+              <w:tcPr>
+                <w:tcW w:w="7442" w:type="dxa"/>
+              </w:tcPr>
+              <w:p>
+                <w:pPr>
+                  <w:pStyle w:val="Nincstrkz"/>
+                  <w:spacing w:line="216" w:lineRule="auto"/>
+                  <w:rPr>
+                    <w:rFonts w:asciiTheme="majorHAnsi" w:eastAsiaTheme="majorEastAsia" w:hAnsiTheme="majorHAnsi" w:cstheme="majorBidi"/>
+                    <w:color w:val="156082" w:themeColor="accent1"/>
+                    <w:sz w:val="88"/>
+                    <w:szCs w:val="88"/>
+                  </w:rPr>
+                </w:pPr>
+                <w:r>
+                  <w:rPr>
+                    <w:rFonts w:asciiTheme="majorHAnsi" w:eastAsiaTheme="majorEastAsia" w:hAnsiTheme="majorHAnsi" w:cstheme="majorBidi"/>
+                    <w:color w:val="156082" w:themeColor="accent1"/>
+                    <w:sz w:val="88"/>
+                    <w:szCs w:val="88"/>
+                  </w:rPr>
+                  <w:t>Beatwave</w:t>
+                </w:r>
+              </w:p>
+            </w:tc>
+          </w:tr>
+          <w:tr>
+            <w:tc>
+              <w:tcPr>
+                <w:tcW w:w="7442" w:type="dxa"/>
+                <w:tcMar>
+                  <w:top w:w="216" w:type="dxa"/>
+                  <w:left w:w="115" w:type="dxa"/>
+                  <w:bottom w:w="216" w:type="dxa"/>
+                  <w:right w:w="115" w:type="dxa"/>
+                </w:tcMar>
+              </w:tcPr>
+              <w:p>
+                <w:pPr>
+                  <w:pStyle w:val="Nincstrkz"/>
+                  <w:rPr>
+                    <w:color w:val="0F4761" w:themeColor="accent1" w:themeShade="BF"/>
+                    <w:sz w:val="24"/>
+                  </w:rPr>
+                </w:pPr>
+              </w:p>
+            </w:tc>
+          </w:tr>
+        </w:tbl>
+        <w:p>
+          <w:r>
+            <w:t xml:space="preserve"> </w:t>
+          </w:r>
+          <w:r>
+            <w:br w:type="page"/>
+          </w:r>
+        </w:p>
+      </w:sdtContent>
+    </w:sdt>
+    <w:sdt>
+      <w:sdtPr>
         <w:rPr>
-          <w:sz w:val="36"/>
-          <w:szCs w:val="36"/>
+          <w:rFonts w:asciiTheme="minorHAnsi" w:eastAsiaTheme="minorHAnsi" w:hAnsiTheme="minorHAnsi" w:cstheme="minorBidi"/>
+          <w:color w:val="auto"/>
+          <w:kern w:val="2"/>
+          <w:sz w:val="24"/>
+          <w:szCs w:val="24"/>
+          <w:lang w:eastAsia="en-US"/>
         </w:rPr>
-      </w:pPr>
-      <w:proofErr w:type="spellStart"/>
-      <w:r>
-        <w:rPr>
-          <w:b/>
-          <w:bCs/>
-          <w:sz w:val="36"/>
-          <w:szCs w:val="36"/>
-        </w:rPr>
-        <w:t>Beatwave</w:t>
-      </w:r>
-      <w:proofErr w:type="spellEnd"/>
-      <w:r>
-        <w:rPr>
-          <w:b/>
-          <w:bCs/>
-          <w:sz w:val="36"/>
-          <w:szCs w:val="36"/>
-        </w:rPr>
-        <w:t xml:space="preserve"> – Projektleírás</w:t>
-      </w:r>
-    </w:p>
-    <w:p/>
-    <w:p>
-      <w:r>
-        <w:t xml:space="preserve">A </w:t>
-      </w:r>
-      <w:proofErr w:type="spellStart"/>
-      <w:r>
+        <w:id w:val="-1743941805"/>
+        <w:docPartObj>
+          <w:docPartGallery w:val="Table of Contents"/>
+          <w:docPartUnique/>
+        </w:docPartObj>
+      </w:sdtPr>
+      <w:sdtEndPr>
         <w:rPr>
           <w:b/>
           <w:bCs/>
         </w:rPr>
+      </w:sdtEndPr>
+      <w:sdtContent>
+        <w:p>
+          <w:pPr>
+            <w:pStyle w:val="Tartalomjegyzkcmsora"/>
+          </w:pPr>
+          <w:r>
+            <w:t>Tartalom</w:t>
+          </w:r>
+        </w:p>
+        <w:p>
+          <w:pPr>
+            <w:pStyle w:val="TJ1"/>
+            <w:tabs>
+              <w:tab w:val="right" w:leader="dot" w:pos="9062"/>
+            </w:tabs>
+            <w:rPr>
+              <w:rFonts w:eastAsiaTheme="minorEastAsia"/>
+              <w:noProof/>
+              <w:lang w:eastAsia="hu-HU"/>
+            </w:rPr>
+          </w:pPr>
+          <w:r>
+            <w:fldChar w:fldCharType="begin"/>
+          </w:r>
+          <w:r>
+            <w:instrText xml:space="preserve"> TOC \o "1-3" \h \z \u </w:instrText>
+          </w:r>
+          <w:r>
+            <w:fldChar w:fldCharType="separate"/>
+          </w:r>
+          <w:hyperlink w:anchor="_Toc225791682" w:history="1">
+            <w:r>
+              <w:rPr>
+                <w:rStyle w:val="Hiperhivatkozs"/>
+                <w:noProof/>
+              </w:rPr>
+              <w:t>Projektleírás</w:t>
+            </w:r>
+            <w:r>
+              <w:rPr>
+                <w:noProof/>
+                <w:webHidden/>
+              </w:rPr>
+              <w:tab/>
+            </w:r>
+            <w:r>
+              <w:rPr>
+                <w:noProof/>
+                <w:webHidden/>
+              </w:rPr>
+              <w:fldChar w:fldCharType="begin"/>
+            </w:r>
+            <w:r>
+              <w:rPr>
+                <w:noProof/>
+                <w:webHidden/>
+              </w:rPr>
+              <w:instrText xml:space="preserve"> PAGEREF _Toc225791682 \h </w:instrText>
+            </w:r>
+            <w:r>
+              <w:rPr>
+                <w:noProof/>
+                <w:webHidden/>
+              </w:rPr>
+            </w:r>
+            <w:r>
+              <w:rPr>
+                <w:noProof/>
+                <w:webHidden/>
+              </w:rPr>
+              <w:fldChar w:fldCharType="separate"/>
+            </w:r>
+            <w:r>
+              <w:rPr>
+                <w:noProof/>
+                <w:webHidden/>
+              </w:rPr>
+              <w:t>2</w:t>
+            </w:r>
+            <w:r>
+              <w:rPr>
+                <w:noProof/>
+                <w:webHidden/>
+              </w:rPr>
+              <w:fldChar w:fldCharType="end"/>
+            </w:r>
+          </w:hyperlink>
+        </w:p>
+        <w:p>
+          <w:pPr>
+            <w:pStyle w:val="TJ2"/>
+            <w:tabs>
+              <w:tab w:val="right" w:leader="dot" w:pos="9062"/>
+            </w:tabs>
+            <w:rPr>
+              <w:rFonts w:eastAsiaTheme="minorEastAsia"/>
+              <w:noProof/>
+              <w:lang w:eastAsia="hu-HU"/>
+            </w:rPr>
+          </w:pPr>
+          <w:hyperlink w:anchor="_Toc225791683" w:history="1">
+            <w:r>
+              <w:rPr>
+                <w:rStyle w:val="Hiperhivatkozs"/>
+                <w:noProof/>
+              </w:rPr>
+              <w:t>Célközönség</w:t>
+            </w:r>
+            <w:r>
+              <w:rPr>
+                <w:noProof/>
+                <w:webHidden/>
+              </w:rPr>
+              <w:tab/>
+            </w:r>
+            <w:r>
+              <w:rPr>
+                <w:noProof/>
+                <w:webHidden/>
+              </w:rPr>
+              <w:fldChar w:fldCharType="begin"/>
+            </w:r>
+            <w:r>
+              <w:rPr>
+                <w:noProof/>
+                <w:webHidden/>
+              </w:rPr>
+              <w:instrText xml:space="preserve"> PAGEREF _Toc225791683 \h </w:instrText>
+            </w:r>
+            <w:r>
+              <w:rPr>
+                <w:noProof/>
+                <w:webHidden/>
+              </w:rPr>
+            </w:r>
+            <w:r>
+              <w:rPr>
+                <w:noProof/>
+                <w:webHidden/>
+              </w:rPr>
+              <w:fldChar w:fldCharType="separate"/>
+            </w:r>
+            <w:r>
+              <w:rPr>
+                <w:noProof/>
+                <w:webHidden/>
+              </w:rPr>
+              <w:t>2</w:t>
+            </w:r>
+            <w:r>
+              <w:rPr>
+                <w:noProof/>
+                <w:webHidden/>
+              </w:rPr>
+              <w:fldChar w:fldCharType="end"/>
+            </w:r>
+          </w:hyperlink>
+        </w:p>
+        <w:p>
+          <w:pPr>
+            <w:pStyle w:val="TJ2"/>
+            <w:tabs>
+              <w:tab w:val="right" w:leader="dot" w:pos="9062"/>
+            </w:tabs>
+            <w:rPr>
+              <w:rFonts w:eastAsiaTheme="minorEastAsia"/>
+              <w:noProof/>
+              <w:lang w:eastAsia="hu-HU"/>
+            </w:rPr>
+          </w:pPr>
+          <w:hyperlink w:anchor="_Toc225791684" w:history="1">
+            <w:r>
+              <w:rPr>
+                <w:rStyle w:val="Hiperhivatkozs"/>
+                <w:noProof/>
+              </w:rPr>
+              <w:t>Funkciók</w:t>
+            </w:r>
+            <w:r>
+              <w:rPr>
+                <w:noProof/>
+                <w:webHidden/>
+              </w:rPr>
+              <w:tab/>
+            </w:r>
+            <w:r>
+              <w:rPr>
+                <w:noProof/>
+                <w:webHidden/>
+              </w:rPr>
+              <w:fldChar w:fldCharType="begin"/>
+            </w:r>
+            <w:r>
+              <w:rPr>
+                <w:noProof/>
+                <w:webHidden/>
+              </w:rPr>
+              <w:instrText xml:space="preserve"> PAGEREF _Toc225791684 \h </w:instrText>
+            </w:r>
+            <w:r>
+              <w:rPr>
+                <w:noProof/>
+                <w:webHidden/>
+              </w:rPr>
+            </w:r>
+            <w:r>
+              <w:rPr>
+                <w:noProof/>
+                <w:webHidden/>
+              </w:rPr>
+              <w:fldChar w:fldCharType="separate"/>
+            </w:r>
+            <w:r>
+              <w:rPr>
+                <w:noProof/>
+                <w:webHidden/>
+              </w:rPr>
+              <w:t>3</w:t>
+            </w:r>
+            <w:r>
+              <w:rPr>
+                <w:noProof/>
+                <w:webHidden/>
+              </w:rPr>
+              <w:fldChar w:fldCharType="end"/>
+            </w:r>
+          </w:hyperlink>
+        </w:p>
+        <w:p>
+          <w:pPr>
+            <w:pStyle w:val="TJ3"/>
+            <w:tabs>
+              <w:tab w:val="right" w:leader="dot" w:pos="9062"/>
+            </w:tabs>
+            <w:rPr>
+              <w:rFonts w:eastAsiaTheme="minorEastAsia"/>
+              <w:noProof/>
+              <w:lang w:eastAsia="hu-HU"/>
+            </w:rPr>
+          </w:pPr>
+          <w:hyperlink w:anchor="_Toc225791685" w:history="1">
+            <w:r>
+              <w:rPr>
+                <w:rStyle w:val="Hiperhivatkozs"/>
+                <w:noProof/>
+              </w:rPr>
+              <w:t>Spotify fiók csatlakoztatása a profilban</w:t>
+            </w:r>
+            <w:r>
+              <w:rPr>
+                <w:noProof/>
+                <w:webHidden/>
+              </w:rPr>
+              <w:tab/>
+            </w:r>
+            <w:r>
+              <w:rPr>
+                <w:noProof/>
+                <w:webHidden/>
+              </w:rPr>
+              <w:fldChar w:fldCharType="begin"/>
+            </w:r>
+            <w:r>
+              <w:rPr>
+                <w:noProof/>
+                <w:webHidden/>
+              </w:rPr>
+              <w:instrText xml:space="preserve"> PAGEREF _Toc225791685 \h </w:instrText>
+            </w:r>
+            <w:r>
+              <w:rPr>
+                <w:noProof/>
+                <w:webHidden/>
+              </w:rPr>
+            </w:r>
+            <w:r>
+              <w:rPr>
+                <w:noProof/>
+                <w:webHidden/>
+              </w:rPr>
+              <w:fldChar w:fldCharType="separate"/>
+            </w:r>
+            <w:r>
+              <w:rPr>
+                <w:noProof/>
+                <w:webHidden/>
+              </w:rPr>
+              <w:t>3</w:t>
+            </w:r>
+            <w:r>
+              <w:rPr>
+                <w:noProof/>
+                <w:webHidden/>
+              </w:rPr>
+              <w:fldChar w:fldCharType="end"/>
+            </w:r>
+          </w:hyperlink>
+        </w:p>
+        <w:p>
+          <w:pPr>
+            <w:pStyle w:val="TJ3"/>
+            <w:tabs>
+              <w:tab w:val="right" w:leader="dot" w:pos="9062"/>
+            </w:tabs>
+            <w:rPr>
+              <w:rFonts w:eastAsiaTheme="minorEastAsia"/>
+              <w:noProof/>
+              <w:lang w:eastAsia="hu-HU"/>
+            </w:rPr>
+          </w:pPr>
+          <w:hyperlink w:anchor="_Toc225791686" w:history="1">
+            <w:r>
+              <w:rPr>
+                <w:rStyle w:val="Hiperhivatkozs"/>
+                <w:noProof/>
+              </w:rPr>
+              <w:t>Top előadók és számok megjelenítése</w:t>
+            </w:r>
+            <w:r>
+              <w:rPr>
+                <w:noProof/>
+                <w:webHidden/>
+              </w:rPr>
+              <w:tab/>
+            </w:r>
+            <w:r>
+              <w:rPr>
+                <w:noProof/>
+                <w:webHidden/>
+              </w:rPr>
+              <w:fldChar w:fldCharType="begin"/>
+            </w:r>
+            <w:r>
+              <w:rPr>
+                <w:noProof/>
+                <w:webHidden/>
+              </w:rPr>
+              <w:instrText xml:space="preserve"> PAGEREF _Toc225791686 \h </w:instrText>
+            </w:r>
+            <w:r>
+              <w:rPr>
+                <w:noProof/>
+                <w:webHidden/>
+              </w:rPr>
+            </w:r>
+            <w:r>
+              <w:rPr>
+                <w:noProof/>
+                <w:webHidden/>
+              </w:rPr>
+              <w:fldChar w:fldCharType="separate"/>
+            </w:r>
+            <w:r>
+              <w:rPr>
+                <w:noProof/>
+                <w:webHidden/>
+              </w:rPr>
+              <w:t>3</w:t>
+            </w:r>
+            <w:r>
+              <w:rPr>
+                <w:noProof/>
+                <w:webHidden/>
+              </w:rPr>
+              <w:fldChar w:fldCharType="end"/>
+            </w:r>
+          </w:hyperlink>
+        </w:p>
+        <w:p>
+          <w:pPr>
+            <w:pStyle w:val="TJ3"/>
+            <w:tabs>
+              <w:tab w:val="right" w:leader="dot" w:pos="9062"/>
+            </w:tabs>
+            <w:rPr>
+              <w:rFonts w:eastAsiaTheme="minorEastAsia"/>
+              <w:noProof/>
+              <w:lang w:eastAsia="hu-HU"/>
+            </w:rPr>
+          </w:pPr>
+          <w:hyperlink w:anchor="_Toc225791687" w:history="1">
+            <w:r>
+              <w:rPr>
+                <w:rStyle w:val="Hiperhivatkozs"/>
+                <w:noProof/>
+              </w:rPr>
+              <w:t>Aktuálisan játszott zene megjelenítése</w:t>
+            </w:r>
+            <w:r>
+              <w:rPr>
+                <w:noProof/>
+                <w:webHidden/>
+              </w:rPr>
+              <w:tab/>
+            </w:r>
+            <w:r>
+              <w:rPr>
+                <w:noProof/>
+                <w:webHidden/>
+              </w:rPr>
+              <w:fldChar w:fldCharType="begin"/>
+            </w:r>
+            <w:r>
+              <w:rPr>
+                <w:noProof/>
+                <w:webHidden/>
+              </w:rPr>
+              <w:instrText xml:space="preserve"> PAGEREF _Toc225791687 \h </w:instrText>
+            </w:r>
+            <w:r>
+              <w:rPr>
+                <w:noProof/>
+                <w:webHidden/>
+              </w:rPr>
+            </w:r>
+            <w:r>
+              <w:rPr>
+                <w:noProof/>
+                <w:webHidden/>
+              </w:rPr>
+              <w:fldChar w:fldCharType="separate"/>
+            </w:r>
+            <w:r>
+              <w:rPr>
+                <w:noProof/>
+                <w:webHidden/>
+              </w:rPr>
+              <w:t>3</w:t>
+            </w:r>
+            <w:r>
+              <w:rPr>
+                <w:noProof/>
+                <w:webHidden/>
+              </w:rPr>
+              <w:fldChar w:fldCharType="end"/>
+            </w:r>
+          </w:hyperlink>
+        </w:p>
+        <w:p>
+          <w:pPr>
+            <w:pStyle w:val="TJ3"/>
+            <w:tabs>
+              <w:tab w:val="right" w:leader="dot" w:pos="9062"/>
+            </w:tabs>
+            <w:rPr>
+              <w:rFonts w:eastAsiaTheme="minorEastAsia"/>
+              <w:noProof/>
+              <w:lang w:eastAsia="hu-HU"/>
+            </w:rPr>
+          </w:pPr>
+          <w:hyperlink w:anchor="_Toc225791688" w:history="1">
+            <w:r>
+              <w:rPr>
+                <w:rStyle w:val="Hiperhivatkozs"/>
+                <w:noProof/>
+              </w:rPr>
+              <w:t>Kereső funkció</w:t>
+            </w:r>
+            <w:r>
+              <w:rPr>
+                <w:noProof/>
+                <w:webHidden/>
+              </w:rPr>
+              <w:tab/>
+            </w:r>
+            <w:r>
+              <w:rPr>
+                <w:noProof/>
+                <w:webHidden/>
+              </w:rPr>
+              <w:fldChar w:fldCharType="begin"/>
+            </w:r>
+            <w:r>
+              <w:rPr>
+                <w:noProof/>
+                <w:webHidden/>
+              </w:rPr>
+              <w:instrText xml:space="preserve"> PAGEREF _Toc225791688 \h </w:instrText>
+            </w:r>
+            <w:r>
+              <w:rPr>
+                <w:noProof/>
+                <w:webHidden/>
+              </w:rPr>
+            </w:r>
+            <w:r>
+              <w:rPr>
+                <w:noProof/>
+                <w:webHidden/>
+              </w:rPr>
+              <w:fldChar w:fldCharType="separate"/>
+            </w:r>
+            <w:r>
+              <w:rPr>
+                <w:noProof/>
+                <w:webHidden/>
+              </w:rPr>
+              <w:t>3</w:t>
+            </w:r>
+            <w:r>
+              <w:rPr>
+                <w:noProof/>
+                <w:webHidden/>
+              </w:rPr>
+              <w:fldChar w:fldCharType="end"/>
+            </w:r>
+          </w:hyperlink>
+        </w:p>
+        <w:p>
+          <w:pPr>
+            <w:pStyle w:val="TJ3"/>
+            <w:tabs>
+              <w:tab w:val="right" w:leader="dot" w:pos="9062"/>
+            </w:tabs>
+            <w:rPr>
+              <w:rFonts w:eastAsiaTheme="minorEastAsia"/>
+              <w:noProof/>
+              <w:lang w:eastAsia="hu-HU"/>
+            </w:rPr>
+          </w:pPr>
+          <w:hyperlink w:anchor="_Toc225791689" w:history="1">
+            <w:r>
+              <w:rPr>
+                <w:rStyle w:val="Hiperhivatkozs"/>
+                <w:noProof/>
+              </w:rPr>
+              <w:t>Közösségi beszélgetések (Discussion)</w:t>
+            </w:r>
+            <w:r>
+              <w:rPr>
+                <w:noProof/>
+                <w:webHidden/>
+              </w:rPr>
+              <w:tab/>
+            </w:r>
+            <w:r>
+              <w:rPr>
+                <w:noProof/>
+                <w:webHidden/>
+              </w:rPr>
+              <w:fldChar w:fldCharType="begin"/>
+            </w:r>
+            <w:r>
+              <w:rPr>
+                <w:noProof/>
+                <w:webHidden/>
+              </w:rPr>
+              <w:instrText xml:space="preserve"> PAGEREF _Toc225791689 \h </w:instrText>
+            </w:r>
+            <w:r>
+              <w:rPr>
+                <w:noProof/>
+                <w:webHidden/>
+              </w:rPr>
+            </w:r>
+            <w:r>
+              <w:rPr>
+                <w:noProof/>
+                <w:webHidden/>
+              </w:rPr>
+              <w:fldChar w:fldCharType="separate"/>
+            </w:r>
+            <w:r>
+              <w:rPr>
+                <w:noProof/>
+                <w:webHidden/>
+              </w:rPr>
+              <w:t>3</w:t>
+            </w:r>
+            <w:r>
+              <w:rPr>
+                <w:noProof/>
+                <w:webHidden/>
+              </w:rPr>
+              <w:fldChar w:fldCharType="end"/>
+            </w:r>
+          </w:hyperlink>
+        </w:p>
+        <w:p>
+          <w:pPr>
+            <w:pStyle w:val="TJ1"/>
+            <w:tabs>
+              <w:tab w:val="right" w:leader="dot" w:pos="9062"/>
+            </w:tabs>
+            <w:rPr>
+              <w:rFonts w:eastAsiaTheme="minorEastAsia"/>
+              <w:noProof/>
+              <w:lang w:eastAsia="hu-HU"/>
+            </w:rPr>
+          </w:pPr>
+          <w:hyperlink w:anchor="_Toc225791690" w:history="1">
+            <w:r>
+              <w:rPr>
+                <w:rStyle w:val="Hiperhivatkozs"/>
+                <w:noProof/>
+              </w:rPr>
+              <w:t>Fejlesztői dokumentáció</w:t>
+            </w:r>
+            <w:r>
+              <w:rPr>
+                <w:noProof/>
+                <w:webHidden/>
+              </w:rPr>
+              <w:tab/>
+            </w:r>
+            <w:r>
+              <w:rPr>
+                <w:noProof/>
+                <w:webHidden/>
+              </w:rPr>
+              <w:fldChar w:fldCharType="begin"/>
+            </w:r>
+            <w:r>
+              <w:rPr>
+                <w:noProof/>
+                <w:webHidden/>
+              </w:rPr>
+              <w:instrText xml:space="preserve"> PAGEREF _Toc225791690 \h </w:instrText>
+            </w:r>
+            <w:r>
+              <w:rPr>
+                <w:noProof/>
+                <w:webHidden/>
+              </w:rPr>
+            </w:r>
+            <w:r>
+              <w:rPr>
+                <w:noProof/>
+                <w:webHidden/>
+              </w:rPr>
+              <w:fldChar w:fldCharType="separate"/>
+            </w:r>
+            <w:r>
+              <w:rPr>
+                <w:noProof/>
+                <w:webHidden/>
+              </w:rPr>
+              <w:t>4</w:t>
+            </w:r>
+            <w:r>
+              <w:rPr>
+                <w:noProof/>
+                <w:webHidden/>
+              </w:rPr>
+              <w:fldChar w:fldCharType="end"/>
+            </w:r>
+          </w:hyperlink>
+        </w:p>
+        <w:p>
+          <w:pPr>
+            <w:pStyle w:val="TJ2"/>
+            <w:tabs>
+              <w:tab w:val="right" w:leader="dot" w:pos="9062"/>
+            </w:tabs>
+            <w:rPr>
+              <w:rFonts w:eastAsiaTheme="minorEastAsia"/>
+              <w:noProof/>
+              <w:lang w:eastAsia="hu-HU"/>
+            </w:rPr>
+          </w:pPr>
+          <w:hyperlink w:anchor="_Toc225791691" w:history="1">
+            <w:r>
+              <w:rPr>
+                <w:rStyle w:val="Hiperhivatkozs"/>
+                <w:noProof/>
+              </w:rPr>
+              <w:t>Miért volt rá szükség?</w:t>
+            </w:r>
+            <w:r>
+              <w:rPr>
+                <w:noProof/>
+                <w:webHidden/>
+              </w:rPr>
+              <w:tab/>
+            </w:r>
+            <w:r>
+              <w:rPr>
+                <w:noProof/>
+                <w:webHidden/>
+              </w:rPr>
+              <w:fldChar w:fldCharType="begin"/>
+            </w:r>
+            <w:r>
+              <w:rPr>
+                <w:noProof/>
+                <w:webHidden/>
+              </w:rPr>
+              <w:instrText xml:space="preserve"> PAGEREF _Toc225791691 \h </w:instrText>
+            </w:r>
+            <w:r>
+              <w:rPr>
+                <w:noProof/>
+                <w:webHidden/>
+              </w:rPr>
+            </w:r>
+            <w:r>
+              <w:rPr>
+                <w:noProof/>
+                <w:webHidden/>
+              </w:rPr>
+              <w:fldChar w:fldCharType="separate"/>
+            </w:r>
+            <w:r>
+              <w:rPr>
+                <w:noProof/>
+                <w:webHidden/>
+              </w:rPr>
+              <w:t>4</w:t>
+            </w:r>
+            <w:r>
+              <w:rPr>
+                <w:noProof/>
+                <w:webHidden/>
+              </w:rPr>
+              <w:fldChar w:fldCharType="end"/>
+            </w:r>
+          </w:hyperlink>
+        </w:p>
+        <w:p>
+          <w:pPr>
+            <w:pStyle w:val="TJ2"/>
+            <w:tabs>
+              <w:tab w:val="right" w:leader="dot" w:pos="9062"/>
+            </w:tabs>
+            <w:rPr>
+              <w:rFonts w:eastAsiaTheme="minorEastAsia"/>
+              <w:noProof/>
+              <w:lang w:eastAsia="hu-HU"/>
+            </w:rPr>
+          </w:pPr>
+          <w:hyperlink w:anchor="_Toc225791692" w:history="1">
+            <w:r>
+              <w:rPr>
+                <w:rStyle w:val="Hiperhivatkozs"/>
+                <w:noProof/>
+              </w:rPr>
+              <w:t>Fejleszőkörnyezet</w:t>
+            </w:r>
+            <w:r>
+              <w:rPr>
+                <w:noProof/>
+                <w:webHidden/>
+              </w:rPr>
+              <w:tab/>
+            </w:r>
+            <w:r>
+              <w:rPr>
+                <w:noProof/>
+                <w:webHidden/>
+              </w:rPr>
+              <w:fldChar w:fldCharType="begin"/>
+            </w:r>
+            <w:r>
+              <w:rPr>
+                <w:noProof/>
+                <w:webHidden/>
+              </w:rPr>
+              <w:instrText xml:space="preserve"> PAGEREF _Toc225791692 \h </w:instrText>
+            </w:r>
+            <w:r>
+              <w:rPr>
+                <w:noProof/>
+                <w:webHidden/>
+              </w:rPr>
+            </w:r>
+            <w:r>
+              <w:rPr>
+                <w:noProof/>
+                <w:webHidden/>
+              </w:rPr>
+              <w:fldChar w:fldCharType="separate"/>
+            </w:r>
+            <w:r>
+              <w:rPr>
+                <w:noProof/>
+                <w:webHidden/>
+              </w:rPr>
+              <w:t>4</w:t>
+            </w:r>
+            <w:r>
+              <w:rPr>
+                <w:noProof/>
+                <w:webHidden/>
+              </w:rPr>
+              <w:fldChar w:fldCharType="end"/>
+            </w:r>
+          </w:hyperlink>
+        </w:p>
+        <w:p>
+          <w:pPr>
+            <w:pStyle w:val="TJ3"/>
+            <w:tabs>
+              <w:tab w:val="right" w:leader="dot" w:pos="9062"/>
+            </w:tabs>
+            <w:rPr>
+              <w:rFonts w:eastAsiaTheme="minorEastAsia"/>
+              <w:noProof/>
+              <w:lang w:eastAsia="hu-HU"/>
+            </w:rPr>
+          </w:pPr>
+          <w:hyperlink w:anchor="_Toc225791693" w:history="1">
+            <w:r>
+              <w:rPr>
+                <w:rStyle w:val="Hiperhivatkozs"/>
+                <w:noProof/>
+              </w:rPr>
+              <w:t>Hardver</w:t>
+            </w:r>
+            <w:r>
+              <w:rPr>
+                <w:noProof/>
+                <w:webHidden/>
+              </w:rPr>
+              <w:tab/>
+            </w:r>
+            <w:r>
+              <w:rPr>
+                <w:noProof/>
+                <w:webHidden/>
+              </w:rPr>
+              <w:fldChar w:fldCharType="begin"/>
+            </w:r>
+            <w:r>
+              <w:rPr>
+                <w:noProof/>
+                <w:webHidden/>
+              </w:rPr>
+              <w:instrText xml:space="preserve"> PAGEREF _Toc225791693 \h </w:instrText>
+            </w:r>
+            <w:r>
+              <w:rPr>
+                <w:noProof/>
+                <w:webHidden/>
+              </w:rPr>
+            </w:r>
+            <w:r>
+              <w:rPr>
+                <w:noProof/>
+                <w:webHidden/>
+              </w:rPr>
+              <w:fldChar w:fldCharType="separate"/>
+            </w:r>
+            <w:r>
+              <w:rPr>
+                <w:noProof/>
+                <w:webHidden/>
+              </w:rPr>
+              <w:t>4</w:t>
+            </w:r>
+            <w:r>
+              <w:rPr>
+                <w:noProof/>
+                <w:webHidden/>
+              </w:rPr>
+              <w:fldChar w:fldCharType="end"/>
+            </w:r>
+          </w:hyperlink>
+        </w:p>
+        <w:p>
+          <w:pPr>
+            <w:pStyle w:val="TJ3"/>
+            <w:tabs>
+              <w:tab w:val="right" w:leader="dot" w:pos="9062"/>
+            </w:tabs>
+            <w:rPr>
+              <w:rFonts w:eastAsiaTheme="minorEastAsia"/>
+              <w:noProof/>
+              <w:lang w:eastAsia="hu-HU"/>
+            </w:rPr>
+          </w:pPr>
+          <w:hyperlink w:anchor="_Toc225791694" w:history="1">
+            <w:r>
+              <w:rPr>
+                <w:rStyle w:val="Hiperhivatkozs"/>
+                <w:noProof/>
+              </w:rPr>
+              <w:t>Használt szoftverek</w:t>
+            </w:r>
+            <w:r>
+              <w:rPr>
+                <w:noProof/>
+                <w:webHidden/>
+              </w:rPr>
+              <w:tab/>
+            </w:r>
+            <w:r>
+              <w:rPr>
+                <w:noProof/>
+                <w:webHidden/>
+              </w:rPr>
+              <w:fldChar w:fldCharType="begin"/>
+            </w:r>
+            <w:r>
+              <w:rPr>
+                <w:noProof/>
+                <w:webHidden/>
+              </w:rPr>
+              <w:instrText xml:space="preserve"> PAGEREF _Toc225791694 \h </w:instrText>
+            </w:r>
+            <w:r>
+              <w:rPr>
+                <w:noProof/>
+                <w:webHidden/>
+              </w:rPr>
+            </w:r>
+            <w:r>
+              <w:rPr>
+                <w:noProof/>
+                <w:webHidden/>
+              </w:rPr>
+              <w:fldChar w:fldCharType="separate"/>
+            </w:r>
+            <w:r>
+              <w:rPr>
+                <w:noProof/>
+                <w:webHidden/>
+              </w:rPr>
+              <w:t>4</w:t>
+            </w:r>
+            <w:r>
+              <w:rPr>
+                <w:noProof/>
+                <w:webHidden/>
+              </w:rPr>
+              <w:fldChar w:fldCharType="end"/>
+            </w:r>
+          </w:hyperlink>
+        </w:p>
+        <w:p>
+          <w:pPr>
+            <w:pStyle w:val="TJ3"/>
+            <w:tabs>
+              <w:tab w:val="right" w:leader="dot" w:pos="9062"/>
+            </w:tabs>
+            <w:rPr>
+              <w:rFonts w:eastAsiaTheme="minorEastAsia"/>
+              <w:noProof/>
+              <w:lang w:eastAsia="hu-HU"/>
+            </w:rPr>
+          </w:pPr>
+          <w:hyperlink w:anchor="_Toc225791695" w:history="1">
+            <w:r>
+              <w:rPr>
+                <w:rStyle w:val="Hiperhivatkozs"/>
+                <w:i/>
+                <w:iCs/>
+                <w:noProof/>
+              </w:rPr>
+              <w:t>Visual Studio Code (VS Code)</w:t>
+            </w:r>
+            <w:r>
+              <w:rPr>
+                <w:noProof/>
+                <w:webHidden/>
+              </w:rPr>
+              <w:tab/>
+            </w:r>
+            <w:r>
+              <w:rPr>
+                <w:noProof/>
+                <w:webHidden/>
+              </w:rPr>
+              <w:fldChar w:fldCharType="begin"/>
+            </w:r>
+            <w:r>
+              <w:rPr>
+                <w:noProof/>
+                <w:webHidden/>
+              </w:rPr>
+              <w:instrText xml:space="preserve"> PAGEREF _Toc225791695 \h </w:instrText>
+            </w:r>
+            <w:r>
+              <w:rPr>
+                <w:noProof/>
+                <w:webHidden/>
+              </w:rPr>
+            </w:r>
+            <w:r>
+              <w:rPr>
+                <w:noProof/>
+                <w:webHidden/>
+              </w:rPr>
+              <w:fldChar w:fldCharType="separate"/>
+            </w:r>
+            <w:r>
+              <w:rPr>
+                <w:noProof/>
+                <w:webHidden/>
+              </w:rPr>
+              <w:t>4</w:t>
+            </w:r>
+            <w:r>
+              <w:rPr>
+                <w:noProof/>
+                <w:webHidden/>
+              </w:rPr>
+              <w:fldChar w:fldCharType="end"/>
+            </w:r>
+          </w:hyperlink>
+        </w:p>
+        <w:p>
+          <w:pPr>
+            <w:pStyle w:val="TJ3"/>
+            <w:tabs>
+              <w:tab w:val="right" w:leader="dot" w:pos="9062"/>
+            </w:tabs>
+            <w:rPr>
+              <w:rFonts w:eastAsiaTheme="minorEastAsia"/>
+              <w:noProof/>
+              <w:lang w:eastAsia="hu-HU"/>
+            </w:rPr>
+          </w:pPr>
+          <w:hyperlink w:anchor="_Toc225791696" w:history="1">
+            <w:r>
+              <w:rPr>
+                <w:rStyle w:val="Hiperhivatkozs"/>
+                <w:i/>
+                <w:iCs/>
+                <w:noProof/>
+              </w:rPr>
+              <w:t>GitHub Desktop</w:t>
+            </w:r>
+            <w:r>
+              <w:rPr>
+                <w:noProof/>
+                <w:webHidden/>
+              </w:rPr>
+              <w:tab/>
+            </w:r>
+            <w:r>
+              <w:rPr>
+                <w:noProof/>
+                <w:webHidden/>
+              </w:rPr>
+              <w:fldChar w:fldCharType="begin"/>
+            </w:r>
+            <w:r>
+              <w:rPr>
+                <w:noProof/>
+                <w:webHidden/>
+              </w:rPr>
+              <w:instrText xml:space="preserve"> PAGEREF _Toc225791696 \h </w:instrText>
+            </w:r>
+            <w:r>
+              <w:rPr>
+                <w:noProof/>
+                <w:webHidden/>
+              </w:rPr>
+            </w:r>
+            <w:r>
+              <w:rPr>
+                <w:noProof/>
+                <w:webHidden/>
+              </w:rPr>
+              <w:fldChar w:fldCharType="separate"/>
+            </w:r>
+            <w:r>
+              <w:rPr>
+                <w:noProof/>
+                <w:webHidden/>
+              </w:rPr>
+              <w:t>5</w:t>
+            </w:r>
+            <w:r>
+              <w:rPr>
+                <w:noProof/>
+                <w:webHidden/>
+              </w:rPr>
+              <w:fldChar w:fldCharType="end"/>
+            </w:r>
+          </w:hyperlink>
+        </w:p>
+        <w:p>
+          <w:pPr>
+            <w:pStyle w:val="TJ3"/>
+            <w:tabs>
+              <w:tab w:val="right" w:leader="dot" w:pos="9062"/>
+            </w:tabs>
+            <w:rPr>
+              <w:rFonts w:eastAsiaTheme="minorEastAsia"/>
+              <w:noProof/>
+              <w:lang w:eastAsia="hu-HU"/>
+            </w:rPr>
+          </w:pPr>
+          <w:hyperlink w:anchor="_Toc225791697" w:history="1">
+            <w:r>
+              <w:rPr>
+                <w:rStyle w:val="Hiperhivatkozs"/>
+                <w:i/>
+                <w:iCs/>
+                <w:noProof/>
+              </w:rPr>
+              <w:t>XAMPP</w:t>
+            </w:r>
+            <w:r>
+              <w:rPr>
+                <w:noProof/>
+                <w:webHidden/>
+              </w:rPr>
+              <w:tab/>
+            </w:r>
+            <w:r>
+              <w:rPr>
+                <w:noProof/>
+                <w:webHidden/>
+              </w:rPr>
+              <w:fldChar w:fldCharType="begin"/>
+            </w:r>
+            <w:r>
+              <w:rPr>
+                <w:noProof/>
+                <w:webHidden/>
+              </w:rPr>
+              <w:instrText xml:space="preserve"> PAGEREF _Toc225791697 \h </w:instrText>
+            </w:r>
+            <w:r>
+              <w:rPr>
+                <w:noProof/>
+                <w:webHidden/>
+              </w:rPr>
+            </w:r>
+            <w:r>
+              <w:rPr>
+                <w:noProof/>
+                <w:webHidden/>
+              </w:rPr>
+              <w:fldChar w:fldCharType="separate"/>
+            </w:r>
+            <w:r>
+              <w:rPr>
+                <w:noProof/>
+                <w:webHidden/>
+              </w:rPr>
+              <w:t>5</w:t>
+            </w:r>
+            <w:r>
+              <w:rPr>
+                <w:noProof/>
+                <w:webHidden/>
+              </w:rPr>
+              <w:fldChar w:fldCharType="end"/>
+            </w:r>
+          </w:hyperlink>
+        </w:p>
+        <w:p>
+          <w:pPr>
+            <w:pStyle w:val="TJ3"/>
+            <w:tabs>
+              <w:tab w:val="right" w:leader="dot" w:pos="9062"/>
+            </w:tabs>
+            <w:rPr>
+              <w:rFonts w:eastAsiaTheme="minorEastAsia"/>
+              <w:noProof/>
+              <w:lang w:eastAsia="hu-HU"/>
+            </w:rPr>
+          </w:pPr>
+          <w:hyperlink w:anchor="_Toc225791698" w:history="1">
+            <w:r>
+              <w:rPr>
+                <w:rStyle w:val="Hiperhivatkozs"/>
+                <w:i/>
+                <w:iCs/>
+                <w:noProof/>
+              </w:rPr>
+              <w:t>Prisma</w:t>
+            </w:r>
+            <w:r>
+              <w:rPr>
+                <w:noProof/>
+                <w:webHidden/>
+              </w:rPr>
+              <w:tab/>
+            </w:r>
+            <w:r>
+              <w:rPr>
+                <w:noProof/>
+                <w:webHidden/>
+              </w:rPr>
+              <w:fldChar w:fldCharType="begin"/>
+            </w:r>
+            <w:r>
+              <w:rPr>
+                <w:noProof/>
+                <w:webHidden/>
+              </w:rPr>
+              <w:instrText xml:space="preserve"> PAGEREF _Toc225791698 \h </w:instrText>
+            </w:r>
+            <w:r>
+              <w:rPr>
+                <w:noProof/>
+                <w:webHidden/>
+              </w:rPr>
+            </w:r>
+            <w:r>
+              <w:rPr>
+                <w:noProof/>
+                <w:webHidden/>
+              </w:rPr>
+              <w:fldChar w:fldCharType="separate"/>
+            </w:r>
+            <w:r>
+              <w:rPr>
+                <w:noProof/>
+                <w:webHidden/>
+              </w:rPr>
+              <w:t>5</w:t>
+            </w:r>
+            <w:r>
+              <w:rPr>
+                <w:noProof/>
+                <w:webHidden/>
+              </w:rPr>
+              <w:fldChar w:fldCharType="end"/>
+            </w:r>
+          </w:hyperlink>
+        </w:p>
+        <w:p>
+          <w:pPr>
+            <w:pStyle w:val="TJ2"/>
+            <w:tabs>
+              <w:tab w:val="right" w:leader="dot" w:pos="9062"/>
+            </w:tabs>
+            <w:rPr>
+              <w:rFonts w:eastAsiaTheme="minorEastAsia"/>
+              <w:noProof/>
+              <w:lang w:eastAsia="hu-HU"/>
+            </w:rPr>
+          </w:pPr>
+          <w:hyperlink w:anchor="_Toc225791699" w:history="1">
+            <w:r>
+              <w:rPr>
+                <w:rStyle w:val="Hiperhivatkozs"/>
+                <w:noProof/>
+              </w:rPr>
+              <w:t>Adatbázis</w:t>
+            </w:r>
+            <w:r>
+              <w:rPr>
+                <w:noProof/>
+                <w:webHidden/>
+              </w:rPr>
+              <w:tab/>
+            </w:r>
+            <w:r>
+              <w:rPr>
+                <w:noProof/>
+                <w:webHidden/>
+              </w:rPr>
+              <w:fldChar w:fldCharType="begin"/>
+            </w:r>
+            <w:r>
+              <w:rPr>
+                <w:noProof/>
+                <w:webHidden/>
+              </w:rPr>
+              <w:instrText xml:space="preserve"> PAGEREF _Toc225791699 \h </w:instrText>
+            </w:r>
+            <w:r>
+              <w:rPr>
+                <w:noProof/>
+                <w:webHidden/>
+              </w:rPr>
+            </w:r>
+            <w:r>
+              <w:rPr>
+                <w:noProof/>
+                <w:webHidden/>
+              </w:rPr>
+              <w:fldChar w:fldCharType="separate"/>
+            </w:r>
+            <w:r>
+              <w:rPr>
+                <w:noProof/>
+                <w:webHidden/>
+              </w:rPr>
+              <w:t>5</w:t>
+            </w:r>
+            <w:r>
+              <w:rPr>
+                <w:noProof/>
+                <w:webHidden/>
+              </w:rPr>
+              <w:fldChar w:fldCharType="end"/>
+            </w:r>
+          </w:hyperlink>
+        </w:p>
+        <w:p>
+          <w:pPr>
+            <w:pStyle w:val="TJ2"/>
+            <w:tabs>
+              <w:tab w:val="right" w:leader="dot" w:pos="9062"/>
+            </w:tabs>
+            <w:rPr>
+              <w:rFonts w:eastAsiaTheme="minorEastAsia"/>
+              <w:noProof/>
+              <w:lang w:eastAsia="hu-HU"/>
+            </w:rPr>
+          </w:pPr>
+          <w:hyperlink w:anchor="_Toc225791700" w:history="1">
+            <w:r>
+              <w:rPr>
+                <w:rStyle w:val="Hiperhivatkozs"/>
+                <w:noProof/>
+              </w:rPr>
+              <w:t>Algoritmusok</w:t>
+            </w:r>
+            <w:r>
+              <w:rPr>
+                <w:noProof/>
+                <w:webHidden/>
+              </w:rPr>
+              <w:tab/>
+            </w:r>
+            <w:r>
+              <w:rPr>
+                <w:noProof/>
+                <w:webHidden/>
+              </w:rPr>
+              <w:fldChar w:fldCharType="begin"/>
+            </w:r>
+            <w:r>
+              <w:rPr>
+                <w:noProof/>
+                <w:webHidden/>
+              </w:rPr>
+              <w:instrText xml:space="preserve"> PAGEREF _Toc225791700 \h </w:instrText>
+            </w:r>
+            <w:r>
+              <w:rPr>
+                <w:noProof/>
+                <w:webHidden/>
+              </w:rPr>
+            </w:r>
+            <w:r>
+              <w:rPr>
+                <w:noProof/>
+                <w:webHidden/>
+              </w:rPr>
+              <w:fldChar w:fldCharType="separate"/>
+            </w:r>
+            <w:r>
+              <w:rPr>
+                <w:noProof/>
+                <w:webHidden/>
+              </w:rPr>
+              <w:t>6</w:t>
+            </w:r>
+            <w:r>
+              <w:rPr>
+                <w:noProof/>
+                <w:webHidden/>
+              </w:rPr>
+              <w:fldChar w:fldCharType="end"/>
+            </w:r>
+          </w:hyperlink>
+        </w:p>
+        <w:p>
+          <w:pPr>
+            <w:pStyle w:val="TJ2"/>
+            <w:tabs>
+              <w:tab w:val="right" w:leader="dot" w:pos="9062"/>
+            </w:tabs>
+            <w:rPr>
+              <w:rFonts w:eastAsiaTheme="minorEastAsia"/>
+              <w:noProof/>
+              <w:lang w:eastAsia="hu-HU"/>
+            </w:rPr>
+          </w:pPr>
+          <w:hyperlink w:anchor="_Toc225791701" w:history="1">
+            <w:r>
+              <w:rPr>
+                <w:rStyle w:val="Hiperhivatkozs"/>
+                <w:noProof/>
+              </w:rPr>
+              <w:t>Tesztelés</w:t>
+            </w:r>
+            <w:r>
+              <w:rPr>
+                <w:noProof/>
+                <w:webHidden/>
+              </w:rPr>
+              <w:tab/>
+            </w:r>
+            <w:r>
+              <w:rPr>
+                <w:noProof/>
+                <w:webHidden/>
+              </w:rPr>
+              <w:fldChar w:fldCharType="begin"/>
+            </w:r>
+            <w:r>
+              <w:rPr>
+                <w:noProof/>
+                <w:webHidden/>
+              </w:rPr>
+              <w:instrText xml:space="preserve"> PAGEREF _Toc225791701 \h </w:instrText>
+            </w:r>
+            <w:r>
+              <w:rPr>
+                <w:noProof/>
+                <w:webHidden/>
+              </w:rPr>
+            </w:r>
+            <w:r>
+              <w:rPr>
+                <w:noProof/>
+                <w:webHidden/>
+              </w:rPr>
+              <w:fldChar w:fldCharType="separate"/>
+            </w:r>
+            <w:r>
+              <w:rPr>
+                <w:noProof/>
+                <w:webHidden/>
+              </w:rPr>
+              <w:t>7</w:t>
+            </w:r>
+            <w:r>
+              <w:rPr>
+                <w:noProof/>
+                <w:webHidden/>
+              </w:rPr>
+              <w:fldChar w:fldCharType="end"/>
+            </w:r>
+          </w:hyperlink>
+        </w:p>
+        <w:p>
+          <w:pPr>
+            <w:pStyle w:val="TJ2"/>
+            <w:tabs>
+              <w:tab w:val="right" w:leader="dot" w:pos="9062"/>
+            </w:tabs>
+            <w:rPr>
+              <w:rFonts w:eastAsiaTheme="minorEastAsia"/>
+              <w:noProof/>
+              <w:lang w:eastAsia="hu-HU"/>
+            </w:rPr>
+          </w:pPr>
+          <w:hyperlink w:anchor="_Toc225791702" w:history="1">
+            <w:r>
+              <w:rPr>
+                <w:rStyle w:val="Hiperhivatkozs"/>
+                <w:noProof/>
+              </w:rPr>
+              <w:t>Fejlesztési lehetőségek</w:t>
+            </w:r>
+            <w:r>
+              <w:rPr>
+                <w:noProof/>
+                <w:webHidden/>
+              </w:rPr>
+              <w:tab/>
+            </w:r>
+            <w:r>
+              <w:rPr>
+                <w:noProof/>
+                <w:webHidden/>
+              </w:rPr>
+              <w:fldChar w:fldCharType="begin"/>
+            </w:r>
+            <w:r>
+              <w:rPr>
+                <w:noProof/>
+                <w:webHidden/>
+              </w:rPr>
+              <w:instrText xml:space="preserve"> PAGEREF _Toc225791702 \h </w:instrText>
+            </w:r>
+            <w:r>
+              <w:rPr>
+                <w:noProof/>
+                <w:webHidden/>
+              </w:rPr>
+            </w:r>
+            <w:r>
+              <w:rPr>
+                <w:noProof/>
+                <w:webHidden/>
+              </w:rPr>
+              <w:fldChar w:fldCharType="separate"/>
+            </w:r>
+            <w:r>
+              <w:rPr>
+                <w:noProof/>
+                <w:webHidden/>
+              </w:rPr>
+              <w:t>8</w:t>
+            </w:r>
+            <w:r>
+              <w:rPr>
+                <w:noProof/>
+                <w:webHidden/>
+              </w:rPr>
+              <w:fldChar w:fldCharType="end"/>
+            </w:r>
+          </w:hyperlink>
+        </w:p>
+        <w:p>
+          <w:pPr>
+            <w:pStyle w:val="TJ2"/>
+            <w:tabs>
+              <w:tab w:val="right" w:leader="dot" w:pos="9062"/>
+            </w:tabs>
+            <w:rPr>
+              <w:rFonts w:eastAsiaTheme="minorEastAsia"/>
+              <w:noProof/>
+              <w:lang w:eastAsia="hu-HU"/>
+            </w:rPr>
+          </w:pPr>
+          <w:hyperlink w:anchor="_Toc225791703" w:history="1">
+            <w:r>
+              <w:rPr>
+                <w:rStyle w:val="Hiperhivatkozs"/>
+                <w:noProof/>
+              </w:rPr>
+              <w:t>Képek föltöltése</w:t>
+            </w:r>
+            <w:r>
+              <w:rPr>
+                <w:noProof/>
+                <w:webHidden/>
+              </w:rPr>
+              <w:tab/>
+            </w:r>
+            <w:r>
+              <w:rPr>
+                <w:noProof/>
+                <w:webHidden/>
+              </w:rPr>
+              <w:fldChar w:fldCharType="begin"/>
+            </w:r>
+            <w:r>
+              <w:rPr>
+                <w:noProof/>
+                <w:webHidden/>
+              </w:rPr>
+              <w:instrText xml:space="preserve"> PAGEREF _Toc225791703 \h </w:instrText>
+            </w:r>
+            <w:r>
+              <w:rPr>
+                <w:noProof/>
+                <w:webHidden/>
+              </w:rPr>
+            </w:r>
+            <w:r>
+              <w:rPr>
+                <w:noProof/>
+                <w:webHidden/>
+              </w:rPr>
+              <w:fldChar w:fldCharType="separate"/>
+            </w:r>
+            <w:r>
+              <w:rPr>
+                <w:noProof/>
+                <w:webHidden/>
+              </w:rPr>
+              <w:t>8</w:t>
+            </w:r>
+            <w:r>
+              <w:rPr>
+                <w:noProof/>
+                <w:webHidden/>
+              </w:rPr>
+              <w:fldChar w:fldCharType="end"/>
+            </w:r>
+          </w:hyperlink>
+        </w:p>
+        <w:p>
+          <w:pPr>
+            <w:pStyle w:val="TJ2"/>
+            <w:tabs>
+              <w:tab w:val="right" w:leader="dot" w:pos="9062"/>
+            </w:tabs>
+            <w:rPr>
+              <w:rFonts w:eastAsiaTheme="minorEastAsia"/>
+              <w:noProof/>
+              <w:lang w:eastAsia="hu-HU"/>
+            </w:rPr>
+          </w:pPr>
+          <w:hyperlink w:anchor="_Toc225791704" w:history="1">
+            <w:r>
+              <w:rPr>
+                <w:rStyle w:val="Hiperhivatkozs"/>
+                <w:noProof/>
+              </w:rPr>
+              <w:t>Apple Music</w:t>
+            </w:r>
+            <w:r>
+              <w:rPr>
+                <w:noProof/>
+                <w:webHidden/>
+              </w:rPr>
+              <w:tab/>
+            </w:r>
+            <w:r>
+              <w:rPr>
+                <w:noProof/>
+                <w:webHidden/>
+              </w:rPr>
+              <w:fldChar w:fldCharType="begin"/>
+            </w:r>
+            <w:r>
+              <w:rPr>
+                <w:noProof/>
+                <w:webHidden/>
+              </w:rPr>
+              <w:instrText xml:space="preserve"> PAGEREF _Toc225791704 \h </w:instrText>
+            </w:r>
+            <w:r>
+              <w:rPr>
+                <w:noProof/>
+                <w:webHidden/>
+              </w:rPr>
+            </w:r>
+            <w:r>
+              <w:rPr>
+                <w:noProof/>
+                <w:webHidden/>
+              </w:rPr>
+              <w:fldChar w:fldCharType="separate"/>
+            </w:r>
+            <w:r>
+              <w:rPr>
+                <w:noProof/>
+                <w:webHidden/>
+              </w:rPr>
+              <w:t>8</w:t>
+            </w:r>
+            <w:r>
+              <w:rPr>
+                <w:noProof/>
+                <w:webHidden/>
+              </w:rPr>
+              <w:fldChar w:fldCharType="end"/>
+            </w:r>
+          </w:hyperlink>
+        </w:p>
+        <w:p>
+          <w:pPr>
+            <w:pStyle w:val="TJ2"/>
+            <w:tabs>
+              <w:tab w:val="right" w:leader="dot" w:pos="9062"/>
+            </w:tabs>
+            <w:rPr>
+              <w:rFonts w:eastAsiaTheme="minorEastAsia"/>
+              <w:noProof/>
+              <w:lang w:eastAsia="hu-HU"/>
+            </w:rPr>
+          </w:pPr>
+          <w:hyperlink w:anchor="_Toc225791705" w:history="1">
+            <w:r>
+              <w:rPr>
+                <w:rStyle w:val="Hiperhivatkozs"/>
+                <w:noProof/>
+              </w:rPr>
+              <w:t>Alkalmazás készítése</w:t>
+            </w:r>
+            <w:r>
+              <w:rPr>
+                <w:noProof/>
+                <w:webHidden/>
+              </w:rPr>
+              <w:tab/>
+            </w:r>
+            <w:r>
+              <w:rPr>
+                <w:noProof/>
+                <w:webHidden/>
+              </w:rPr>
+              <w:fldChar w:fldCharType="begin"/>
+            </w:r>
+            <w:r>
+              <w:rPr>
+                <w:noProof/>
+                <w:webHidden/>
+              </w:rPr>
+              <w:instrText xml:space="preserve"> PAGEREF _Toc225791705 \h </w:instrText>
+            </w:r>
+            <w:r>
+              <w:rPr>
+                <w:noProof/>
+                <w:webHidden/>
+              </w:rPr>
+            </w:r>
+            <w:r>
+              <w:rPr>
+                <w:noProof/>
+                <w:webHidden/>
+              </w:rPr>
+              <w:fldChar w:fldCharType="separate"/>
+            </w:r>
+            <w:r>
+              <w:rPr>
+                <w:noProof/>
+                <w:webHidden/>
+              </w:rPr>
+              <w:t>8</w:t>
+            </w:r>
+            <w:r>
+              <w:rPr>
+                <w:noProof/>
+                <w:webHidden/>
+              </w:rPr>
+              <w:fldChar w:fldCharType="end"/>
+            </w:r>
+          </w:hyperlink>
+        </w:p>
+        <w:p>
+          <w:pPr>
+            <w:pStyle w:val="TJ1"/>
+            <w:tabs>
+              <w:tab w:val="right" w:leader="dot" w:pos="9062"/>
+            </w:tabs>
+            <w:rPr>
+              <w:rFonts w:eastAsiaTheme="minorEastAsia"/>
+              <w:noProof/>
+              <w:lang w:eastAsia="hu-HU"/>
+            </w:rPr>
+          </w:pPr>
+          <w:hyperlink w:anchor="_Toc225791706" w:history="1">
+            <w:r>
+              <w:rPr>
+                <w:rStyle w:val="Hiperhivatkozs"/>
+                <w:noProof/>
+              </w:rPr>
+              <w:t>Felhasználói dokumentáció</w:t>
+            </w:r>
+            <w:r>
+              <w:rPr>
+                <w:noProof/>
+                <w:webHidden/>
+              </w:rPr>
+              <w:tab/>
+            </w:r>
+            <w:r>
+              <w:rPr>
+                <w:noProof/>
+                <w:webHidden/>
+              </w:rPr>
+              <w:fldChar w:fldCharType="begin"/>
+            </w:r>
+            <w:r>
+              <w:rPr>
+                <w:noProof/>
+                <w:webHidden/>
+              </w:rPr>
+              <w:instrText xml:space="preserve"> PAGEREF _Toc225791706 \h </w:instrText>
+            </w:r>
+            <w:r>
+              <w:rPr>
+                <w:noProof/>
+                <w:webHidden/>
+              </w:rPr>
+            </w:r>
+            <w:r>
+              <w:rPr>
+                <w:noProof/>
+                <w:webHidden/>
+              </w:rPr>
+              <w:fldChar w:fldCharType="separate"/>
+            </w:r>
+            <w:r>
+              <w:rPr>
+                <w:noProof/>
+                <w:webHidden/>
+              </w:rPr>
+              <w:t>9</w:t>
+            </w:r>
+            <w:r>
+              <w:rPr>
+                <w:noProof/>
+                <w:webHidden/>
+              </w:rPr>
+              <w:fldChar w:fldCharType="end"/>
+            </w:r>
+          </w:hyperlink>
+        </w:p>
+        <w:p>
+          <w:r>
+            <w:rPr>
+              <w:b/>
+              <w:bCs/>
+            </w:rPr>
+            <w:fldChar w:fldCharType="end"/>
+          </w:r>
+        </w:p>
+      </w:sdtContent>
+    </w:sdt>
+    <w:p>
+      <w:pPr>
+        <w:rPr>
+          <w:rFonts w:asciiTheme="majorHAnsi" w:eastAsiaTheme="majorEastAsia" w:hAnsiTheme="majorHAnsi" w:cstheme="majorBidi"/>
+          <w:color w:val="0F4761" w:themeColor="accent1" w:themeShade="BF"/>
+          <w:sz w:val="48"/>
+          <w:szCs w:val="48"/>
+        </w:rPr>
+      </w:pPr>
+      <w:r>
+        <w:rPr>
+          <w:sz w:val="48"/>
+          <w:szCs w:val="48"/>
+        </w:rPr>
+        <w:br w:type="page"/>
+      </w:r>
+    </w:p>
+    <w:p>
+      <w:pPr>
+        <w:pStyle w:val="Cmsor1"/>
+        <w:rPr>
+          <w:sz w:val="48"/>
+          <w:szCs w:val="48"/>
+        </w:rPr>
+      </w:pPr>
+      <w:bookmarkStart w:id="0" w:name="_Toc225791682"/>
+      <w:r>
+        <w:rPr>
+          <w:sz w:val="48"/>
+          <w:szCs w:val="48"/>
+        </w:rPr>
+        <w:lastRenderedPageBreak/>
+        <w:t>Projektleírás</w:t>
+      </w:r>
+      <w:bookmarkEnd w:id="0"/>
+    </w:p>
+    <w:p/>
+    <w:p>
+      <w:pPr>
+        <w:jc w:val="both"/>
+      </w:pPr>
+      <w:r>
+        <w:t xml:space="preserve">A </w:t>
+      </w:r>
+      <w:r>
         <w:t>Beatwave</w:t>
       </w:r>
-      <w:proofErr w:type="spellEnd"/>
       <w:r>
         <w:t xml:space="preserve"> egy modern, zenealapú közösségi platform, amely összekapcsolja a felhasználók zenei ízlését és közösségi élményeit. Az oldal fő funkciója, hogy a </w:t>
       </w:r>
-      <w:proofErr w:type="spellStart"/>
+      <w:r>
+        <w:t>Spotify</w:t>
+      </w:r>
+      <w:r>
+        <w:t xml:space="preserve"> és </w:t>
+      </w:r>
+      <w:r>
+        <w:t>SoundCloud</w:t>
+      </w:r>
+      <w:r>
+        <w:t xml:space="preserve"> fiókokból származó adatok alapján megjeleníti a felhasználó leggyakrabban hallgatott zenéit, előadóit és zenei műfajait. Így mindenki átláthatja saját zenei szokásait egy esztétikus, személyre szabott felületen. A rendszer dinamikusan frissül, így mindig a legaktuálisabb toplistákat mutatja, legyen szó heti, havi vagy összesített statisztikákról. </w:t>
+      </w:r>
+    </w:p>
+    <w:p>
+      <w:pPr>
+        <w:jc w:val="both"/>
+      </w:pPr>
+      <w:r>
+        <w:t xml:space="preserve">A Beatwave nemcsak adatvizualizációs eszköz, hanem </w:t>
+      </w:r>
+      <w:r>
+        <w:t>közösségi tér</w:t>
+      </w:r>
+      <w:r>
+        <w:t xml:space="preserve"> is: a felhasználók különböző témájú beszélgetésekben vehetnek részt kedvenc előadóikról, albumokról vagy akár zenei trendekről. A chatfunkció hasonlóan működik, mint az </w:t>
+      </w:r>
+      <w:r>
+        <w:t>Instagram</w:t>
+      </w:r>
       <w:r>
         <w:rPr>
           <w:b/>
           <w:bCs/>
         </w:rPr>
+        <w:t xml:space="preserve"> </w:t>
+      </w:r>
+      <w:r>
+        <w:t>Threads</w:t>
+      </w:r>
+      <w:r>
+        <w:t xml:space="preserve">, így gyors, interaktív és személyes kommunikációra ad lehetőséget. </w:t>
+      </w:r>
+    </w:p>
+    <w:p>
+      <w:pPr>
+        <w:jc w:val="both"/>
+      </w:pPr>
+      <w:r>
+        <w:t xml:space="preserve">A projekt célja, hogy egyesítse a zenei streaming platformok adatainak elemzését a közösségi élménnyel, ezáltal egy olyan digitális helyet hozzon létre, ahol a zene szerelmesei nemcsak hallgatják, hanem </w:t>
+      </w:r>
+      <w:r>
+        <w:t>megosztják és megvitatják</w:t>
+      </w:r>
+      <w:r>
+        <w:t xml:space="preserve"> is a zenét, ami inspirálja őket.</w:t>
+      </w:r>
+    </w:p>
+    <w:p/>
+    <w:p>
+      <w:pPr>
+        <w:pStyle w:val="Cmsor2"/>
+      </w:pPr>
+      <w:bookmarkStart w:id="1" w:name="_Toc225791683"/>
+      <w:r>
+        <w:t>Célközönség</w:t>
+      </w:r>
+      <w:bookmarkEnd w:id="1"/>
+    </w:p>
+    <w:p>
+      <w:pPr>
+        <w:jc w:val="both"/>
+      </w:pPr>
+      <w:r>
+        <w:t xml:space="preserve">Első sorban olyan felhasználóknak, akik sűrűn hallgatnak zenét Spotify-on vagy SoundCloud-on, és kíváncsiak a statisztikájukra. </w:t>
+      </w:r>
+      <w:r>
+        <w:t xml:space="preserve">Emellett </w:t>
+      </w:r>
+      <w:r>
+        <w:t>azoknak is szól, akik szeretnének a kedvenc előadójukról vagy zenéjükről más rajongokkal beszélgetni, vélem</w:t>
+      </w:r>
+      <w:r>
+        <w:t>ényt megosztani.</w:t>
+      </w:r>
+    </w:p>
+    <w:p>
+      <w:pPr>
+        <w:jc w:val="both"/>
+      </w:pPr>
+      <w:r>
+        <w:t xml:space="preserve">Tapasztalataink szerint, nem sok olyan oldal vagy applikáció van, ahol ezeket az adatokat meg lehet tekinteni. A mi oldalunk célja, hogy ezt díjmentesen és egyszerűen megtehessék </w:t>
+      </w:r>
+      <w:r>
+        <w:t>a felhasználók</w:t>
+      </w:r>
+      <w:r>
+        <w:t xml:space="preserve">, ezzel együtt egy </w:t>
+      </w:r>
+      <w:r>
+        <w:t>olyan platformot létrehozni, ahol a zenehallgatók szabadon tudnak kommunikálni egymással.</w:t>
+      </w:r>
+      <w:r>
+        <w:t xml:space="preserve"> Mindemellett zenékre is lehet keresni.</w:t>
+      </w:r>
+    </w:p>
+    <w:p>
+      <w:r>
+        <w:br w:type="page"/>
+      </w:r>
+    </w:p>
+    <w:p>
+      <w:pPr>
+        <w:pStyle w:val="Cmsor2"/>
+      </w:pPr>
+      <w:bookmarkStart w:id="2" w:name="_Toc225791684"/>
+      <w:r>
+        <w:lastRenderedPageBreak/>
+        <w:t>Funkciók</w:t>
+      </w:r>
+      <w:bookmarkEnd w:id="2"/>
+    </w:p>
+    <w:p>
+      <w:pPr>
+        <w:pStyle w:val="Cmsor3"/>
+      </w:pPr>
+      <w:bookmarkStart w:id="3" w:name="_Toc225791685"/>
+      <w:r>
         <w:t>Spotify</w:t>
       </w:r>
-      <w:proofErr w:type="spellEnd"/>
-      <w:r>
-        <w:t xml:space="preserve"> és </w:t>
-      </w:r>
-      <w:proofErr w:type="spellStart"/>
+      <w:r>
+        <w:t xml:space="preserve"> </w:t>
+      </w:r>
+      <w:r>
+        <w:t>fiók csatlakoztatása a profilban</w:t>
+      </w:r>
+      <w:bookmarkEnd w:id="3"/>
+    </w:p>
+    <w:p>
+      <w:pPr>
+        <w:jc w:val="both"/>
+      </w:pPr>
+      <w:r>
+        <w:t>A felhasználók a profiloldalukon keresztül tudják összekapcsolni Spotify fiókjukat a Beatwave platformmal. Ez a csatlakozás szükséges ahhoz, hogy a rendszer hozzáférjen a felhasználó zenei adataihoz, például a leggyakrabban hallgatott előadókhoz és számokhoz. A csatlakoztatás OAuth 2.0 protokollon keresztül történik, amely biztosítja a biztonságos és engedélyezett adatlekérést a Spotify API-tól.</w:t>
+      </w:r>
+    </w:p>
+    <w:p>
+      <w:pPr>
+        <w:pStyle w:val="Cmsor3"/>
+      </w:pPr>
+      <w:bookmarkStart w:id="4" w:name="_Toc225791686"/>
+      <w:r>
+        <w:t>Top előadók és számok megjelenítése</w:t>
+      </w:r>
+      <w:bookmarkEnd w:id="4"/>
+    </w:p>
+    <w:p>
+      <w:pPr>
+        <w:jc w:val="both"/>
+      </w:pPr>
+      <w:r>
+        <w:t>Miután a Spotify fiók csatlakoztatva van, a főoldalon megjelennek a felhasználó legnépszerűbb előadói és zeneszámai. Ezek az adatok a Spotify API által szolgáltatott statisztikák alapján frissülnek dinamikusan, így a felhasználók mindig a legaktuálisabb toplistákat láthatják. Az adatok megjelenítése esztétikus, személyre szabott felületen történik, amely vizuálisan is vonzó és könnyen áttekinthető.</w:t>
+      </w:r>
+    </w:p>
+    <w:p>
+      <w:pPr>
+        <w:pStyle w:val="Cmsor3"/>
+      </w:pPr>
+      <w:bookmarkStart w:id="5" w:name="_Toc225791687"/>
+      <w:r>
+        <w:t>Aktuálisan játszott zene megjelenítése</w:t>
+      </w:r>
+      <w:bookmarkEnd w:id="5"/>
+    </w:p>
+    <w:p>
+      <w:pPr>
+        <w:jc w:val="both"/>
+      </w:pPr>
+      <w:r>
+        <w:t>Ha a felhasználó Spotify-ján éppen zene szól, a Beatwave automatikusan lekéri és megjeleníti az aktuálisan játszott szám adatait (előadó neve, szám címe, borítókép). Ez a funkció valós idejű adatfrissítést igényel, amely a Spotify API „currently playing” végpontját használja. Ezáltal a felhasználók mindig láthatják, milyen zenét hallgatnak, akár a közösségi térben is megoszthatják ezt az információt.</w:t>
+      </w:r>
+    </w:p>
+    <w:p>
+      <w:pPr>
+        <w:pStyle w:val="Cmsor3"/>
+      </w:pPr>
+      <w:bookmarkStart w:id="6" w:name="_Toc225791688"/>
+      <w:r>
+        <w:t>Kereső funkció</w:t>
+      </w:r>
+      <w:bookmarkEnd w:id="6"/>
+    </w:p>
+    <w:p>
+      <w:pPr>
+        <w:jc w:val="both"/>
+      </w:pPr>
+      <w:r>
+        <w:t>A felső menüsorban található keresőmező lehetővé teszi, hogy a felhasználók zenékre, előadókra vagy albumokra keressenek rá. A keresés valós idejű, és a Spotify API kereső végpontját használja, így a találatok gyorsan és relevánsan jelennek meg. Ez a funkció segíti a felhasználókat abban, hogy könnyen megtalálják kedvenc zenéiket vagy új előadókat fedezzenek fel.</w:t>
+      </w:r>
+    </w:p>
+    <w:p>
+      <w:pPr>
+        <w:pStyle w:val="Cmsor3"/>
+      </w:pPr>
+      <w:bookmarkStart w:id="7" w:name="_Toc225791689"/>
+      <w:r>
+        <w:t>Közösségi beszélgetések (Discussion)</w:t>
+      </w:r>
+      <w:bookmarkEnd w:id="7"/>
+    </w:p>
+    <w:p>
+      <w:pPr>
+        <w:jc w:val="both"/>
+      </w:pPr>
+      <w:r>
+        <w:t>A Beatwave nem csupán adatvizualizációs eszköz, hanem közösségi platform is. A „Discussion” menüpont alatt a felhasználók különböző témájú beszélgetésekben vehetnek részt, ahol megoszthatják véleményüket kedvenc előadóikról, albumokról vagy zenei trendekről. A chat funkció hasonló az Instagram Threads-hez, gyors, interaktív és személyes kommunikációt tesz lehetővé. Ez a közösségi tér elősegíti a zene iránti szenvedély megosztását és a felhasználók közötti kapcsolatok építését.</w:t>
+      </w:r>
+    </w:p>
+    <w:p>
+      <w:pPr>
+        <w:jc w:val="both"/>
+      </w:pPr>
+      <w:r>
+        <w:br w:type="page"/>
+      </w:r>
+    </w:p>
+    <w:p>
+      <w:pPr>
+        <w:pStyle w:val="Cmsor1"/>
+      </w:pPr>
+      <w:bookmarkStart w:id="8" w:name="_Toc225791690"/>
+      <w:r>
+        <w:lastRenderedPageBreak/>
+        <w:t>Fejlesztői dokumentáció</w:t>
+      </w:r>
+      <w:bookmarkEnd w:id="8"/>
+    </w:p>
+    <w:p>
+      <w:pPr>
+        <w:pStyle w:val="Cmsor2"/>
+      </w:pPr>
+      <w:bookmarkStart w:id="9" w:name="_Toc225791691"/>
+      <w:r>
+        <w:t>Miért volt rá szükség?</w:t>
+      </w:r>
+      <w:bookmarkEnd w:id="9"/>
+    </w:p>
+    <w:p>
+      <w:pPr>
+        <w:jc w:val="both"/>
+      </w:pPr>
+      <w:r>
+        <w:t>A Beatwave fejlesztésére azért volt szükség, mert a piacon elérhető zenei statisztika- és közösségi platformok, mint például a stats.fm, nem nyújtanak teljes körű és hibamentes élményt a felhasználók számára. Weboldalunk lehetővé teszi, hogy több zenei platformról (Spotify, SoundCloud) is lehessen zenékre keresni, így a felhasználók szélesebb körű adatokat érhetnek el egy helyen.</w:t>
+      </w:r>
+      <w:r>
+        <w:t xml:space="preserve"> </w:t>
+      </w:r>
+      <w:r>
+        <w:t>Ezen túlmenően a Beatwave pontosan és hiba nélkül jeleníti meg a felhasználók által hallgatott zenéket, ellentétben a stats.fm-mel, ahol előfordulhatnak pontatlanságok vagy adatmegjelenítési hibák. Ez a megbízhatóság és a többplatformos keresési lehetőség egyedivé és versenyképessé teszi a programot.</w:t>
+      </w:r>
+      <w:r>
+        <w:t xml:space="preserve"> </w:t>
+      </w:r>
+      <w:r>
+        <w:t>Továbbá a Beatwave nem csupán adatvizualizációs eszköz, hanem egy interaktív közösségi tér is, ahol a felhasználók megoszthatják zenei élményeiket, véleményüket, és aktívan részt vehetnek beszélgetésekben, ami a hasonló szolgáltatásokban ritkán található meg ilyen formában.</w:t>
+      </w:r>
+    </w:p>
+    <w:p>
+      <w:pPr>
+        <w:pStyle w:val="Cmsor2"/>
+      </w:pPr>
+      <w:bookmarkStart w:id="10" w:name="_Toc225791692"/>
+      <w:r>
+        <w:t>Fejleszőkörnyezet</w:t>
+      </w:r>
+      <w:bookmarkEnd w:id="10"/>
+    </w:p>
+    <w:p>
+      <w:pPr>
+        <w:pStyle w:val="Cmsor3"/>
+      </w:pPr>
+      <w:bookmarkStart w:id="11" w:name="_Toc225791693"/>
+      <w:r>
+        <w:t>Hardver</w:t>
+      </w:r>
+      <w:bookmarkEnd w:id="11"/>
+    </w:p>
+    <w:p>
+      <w:r>
+        <w:t>[</w:t>
+      </w:r>
       <w:r>
         <w:rPr>
-          <w:b/>
-          <w:bCs/>
+          <w:noProof/>
         </w:rPr>
-        <w:t>SoundCloud</w:t>
-      </w:r>
-      <w:proofErr w:type="spellEnd"/>
-      <w:r>
-        <w:t xml:space="preserve"> fiókokból származó adatok alapján megjeleníti a felhasználó leggyakrabban hallgatott zenéit, előadóit és zenei műfajait. Így mindenki átláthatja saját zenei szokásait egy esztétikus, személyre szabott felületen. A rendszer dinamikusan frissül, így mindig a legaktuálisabb toplistákat mutatja, legyen szó heti, havi vagy összesített statisztikákról. </w:t>
-      </w:r>
-    </w:p>
-    <w:p>
-      <w:r>
-        <w:t xml:space="preserve">A </w:t>
-      </w:r>
-      <w:proofErr w:type="spellStart"/>
+        <w:drawing>
+          <wp:inline distT="0" distB="0" distL="0" distR="0" wp14:anchorId="23E9EEC6" wp14:editId="4FBA7716">
+            <wp:extent cx="2519616" cy="1354238"/>
+            <wp:effectExtent l="0" t="0" r="0" b="0"/>
+            <wp:docPr id="1309238838" name="Kép 1"/>
+            <wp:cNvGraphicFramePr>
+              <a:graphicFrameLocks xmlns:a="http://schemas.openxmlformats.org/drawingml/2006/main" noChangeAspect="1"/>
+            </wp:cNvGraphicFramePr>
+            <a:graphic xmlns:a="http://schemas.openxmlformats.org/drawingml/2006/main">
+              <a:graphicData uri="http://schemas.openxmlformats.org/drawingml/2006/picture">
+                <pic:pic xmlns:pic="http://schemas.openxmlformats.org/drawingml/2006/picture">
+                  <pic:nvPicPr>
+                    <pic:cNvPr id="1309238838" name=""/>
+                    <pic:cNvPicPr/>
+                  </pic:nvPicPr>
+                  <pic:blipFill>
+                    <a:blip r:embed="rId8"/>
+                    <a:stretch>
+                      <a:fillRect/>
+                    </a:stretch>
+                  </pic:blipFill>
+                  <pic:spPr>
+                    <a:xfrm>
+                      <a:off x="0" y="0"/>
+                      <a:ext cx="2532413" cy="1361116"/>
+                    </a:xfrm>
+                    <a:prstGeom prst="rect">
+                      <a:avLst/>
+                    </a:prstGeom>
+                  </pic:spPr>
+                </pic:pic>
+              </a:graphicData>
+            </a:graphic>
+          </wp:inline>
+        </w:drawing>
+      </w:r>
+      <w:r>
+        <w:t>]</w:t>
+      </w:r>
+    </w:p>
+    <w:p>
+      <w:pPr>
+        <w:pStyle w:val="Cmsor3"/>
+      </w:pPr>
+      <w:bookmarkStart w:id="12" w:name="_Toc225791694"/>
+      <w:r>
+        <w:t xml:space="preserve">Használt </w:t>
+      </w:r>
+      <w:r>
+        <w:t>szoftverek</w:t>
+      </w:r>
+      <w:bookmarkEnd w:id="12"/>
+    </w:p>
+    <w:p>
+      <w:pPr>
+        <w:jc w:val="both"/>
+      </w:pPr>
+      <w:r>
+        <w:t>A projekt fejlesztése során az alábbi eszközöket és szoftvereket használtuk, amelyek hozzájárultak a hatékony munkavégzéshez és a magas minőségű végeredmény eléréséhez:</w:t>
+      </w:r>
+    </w:p>
+    <w:p>
+      <w:pPr>
+        <w:pStyle w:val="Cmsor4"/>
+      </w:pPr>
+      <w:bookmarkStart w:id="13" w:name="_Toc225791695"/>
+      <w:r>
+        <w:rPr>
+          <w:rStyle w:val="Cmsor3Char"/>
+          <w:sz w:val="24"/>
+          <w:szCs w:val="24"/>
+        </w:rPr>
+        <w:t>Visual Studio Code (VS Code)</w:t>
+      </w:r>
+      <w:bookmarkEnd w:id="13"/>
+    </w:p>
+    <w:p>
+      <w:pPr>
+        <w:ind w:left="360"/>
+        <w:jc w:val="both"/>
+      </w:pPr>
+      <w:r>
+        <w:t>Egy könnyen használható, bővíthető kódszerkesztő, amely támogatja a különböző programozási nyelveket és fejlesztési környezeteket. A fejlesztés során a frontend és backend kód írására, valamint a projekt fájljainak kezelésére használtuk.</w:t>
+      </w:r>
+    </w:p>
+    <w:p>
+      <w:pPr>
+        <w:rPr>
+          <w:rStyle w:val="Cmsor3Char"/>
+        </w:rPr>
+      </w:pPr>
+      <w:r>
+        <w:rPr>
+          <w:rStyle w:val="Cmsor3Char"/>
+        </w:rPr>
+        <w:br w:type="page"/>
+      </w:r>
+    </w:p>
+    <w:p>
+      <w:pPr>
+        <w:pStyle w:val="Cmsor4"/>
+      </w:pPr>
+      <w:bookmarkStart w:id="14" w:name="_Toc225791696"/>
+      <w:r>
+        <w:rPr>
+          <w:rStyle w:val="Cmsor3Char"/>
+          <w:sz w:val="24"/>
+          <w:szCs w:val="24"/>
+        </w:rPr>
+        <w:lastRenderedPageBreak/>
+        <w:t>GitHub Desktop</w:t>
+      </w:r>
+      <w:bookmarkEnd w:id="14"/>
+    </w:p>
+    <w:p>
+      <w:pPr>
+        <w:ind w:left="360"/>
+        <w:jc w:val="both"/>
+      </w:pPr>
+      <w:r>
+        <w:t>Egy</w:t>
+      </w:r>
+      <w:r>
+        <w:t xml:space="preserve"> </w:t>
+      </w:r>
+      <w:r>
+        <w:t>grafikus felületű Git kliens, amely megkönnyíti a verziókezelést és a csapatmunkát. Segítségével a forráskód verzióinak nyomon követése, ágak kezelése és a változtatások egyszerű kezelése valósult meg.</w:t>
+      </w:r>
+    </w:p>
+    <w:p>
+      <w:pPr>
+        <w:pStyle w:val="Cmsor4"/>
+      </w:pPr>
+      <w:bookmarkStart w:id="15" w:name="_Toc225791697"/>
+      <w:r>
+        <w:rPr>
+          <w:rStyle w:val="Cmsor3Char"/>
+          <w:sz w:val="24"/>
+          <w:szCs w:val="24"/>
+        </w:rPr>
+        <w:t>XAMPP</w:t>
+      </w:r>
+      <w:bookmarkEnd w:id="15"/>
+    </w:p>
+    <w:p>
+      <w:pPr>
+        <w:ind w:left="360"/>
+        <w:jc w:val="both"/>
+      </w:pPr>
+      <w:r>
+        <w:t>Egy helyi fejlesztői szerver környezet, amely Apache webszervert, MySQL adatbázist és PHP-t tartalmaz. A projekt backend komponenseinek helyi tesztelésére és fejlesztésére használtuk, lehetővé téve a gyors hibakeresést és fejlesztést.</w:t>
+      </w:r>
+    </w:p>
+    <w:p>
+      <w:pPr>
+        <w:pStyle w:val="Cmsor4"/>
+      </w:pPr>
+      <w:bookmarkStart w:id="16" w:name="_Toc225791698"/>
+      <w:r>
+        <w:rPr>
+          <w:rStyle w:val="Cmsor3Char"/>
+        </w:rPr>
+        <w:t>Prisma</w:t>
+      </w:r>
+      <w:bookmarkEnd w:id="16"/>
+    </w:p>
+    <w:p>
+      <w:pPr>
+        <w:ind w:left="360"/>
+        <w:jc w:val="both"/>
+      </w:pPr>
+      <w:r>
+        <w:t>Egy modern ORM (Object-Relational Mapping) eszköz Node.js és TypeScript környezethez, amely leegyszerűsíti az adatbázis-kezelést és típusbiztos lekérdezéseket tesz lehetővé. A projekt adatbázis műveleteinek kezelésére és az adatmodellek kezelésére alkalmaztuk.</w:t>
+      </w:r>
+    </w:p>
+    <w:p>
+      <w:pPr>
+        <w:pStyle w:val="Cmsor2"/>
+      </w:pPr>
+      <w:bookmarkStart w:id="17" w:name="_Toc225791699"/>
+      <w:r>
+        <w:t>Adatbázis</w:t>
+      </w:r>
+      <w:bookmarkEnd w:id="17"/>
+    </w:p>
+    <w:p>
+      <w:r>
+        <w:rPr>
+          <w:noProof/>
+        </w:rPr>
+        <w:drawing>
+          <wp:inline distT="0" distB="0" distL="0" distR="0" wp14:anchorId="7DAD9D98" wp14:editId="07B8B932">
+            <wp:extent cx="5746750" cy="2965450"/>
+            <wp:effectExtent l="0" t="0" r="0" b="0"/>
+            <wp:docPr id="1207328228" name="Kép 1"/>
+            <wp:cNvGraphicFramePr>
+              <a:graphicFrameLocks xmlns:a="http://schemas.openxmlformats.org/drawingml/2006/main" noChangeAspect="1"/>
+            </wp:cNvGraphicFramePr>
+            <a:graphic xmlns:a="http://schemas.openxmlformats.org/drawingml/2006/main">
+              <a:graphicData uri="http://schemas.openxmlformats.org/drawingml/2006/picture">
+                <pic:pic xmlns:pic="http://schemas.openxmlformats.org/drawingml/2006/picture">
+                  <pic:nvPicPr>
+                    <pic:cNvPr id="0" name="Picture 1"/>
+                    <pic:cNvPicPr>
+                      <a:picLocks noChangeAspect="1" noChangeArrowheads="1"/>
+                    </pic:cNvPicPr>
+                  </pic:nvPicPr>
+                  <pic:blipFill>
+                    <a:blip r:embed="rId9" cstate="print">
+                      <a:extLst>
+                        <a:ext uri="{28A0092B-C50C-407E-A947-70E740481C1C}">
+                          <a14:useLocalDpi xmlns:a14="http://schemas.microsoft.com/office/drawing/2010/main" val="0"/>
+                        </a:ext>
+                      </a:extLst>
+                    </a:blip>
+                    <a:srcRect/>
+                    <a:stretch>
+                      <a:fillRect/>
+                    </a:stretch>
+                  </pic:blipFill>
+                  <pic:spPr bwMode="auto">
+                    <a:xfrm>
+                      <a:off x="0" y="0"/>
+                      <a:ext cx="5746750" cy="2965450"/>
+                    </a:xfrm>
+                    <a:prstGeom prst="rect">
+                      <a:avLst/>
+                    </a:prstGeom>
+                    <a:noFill/>
+                    <a:ln>
+                      <a:noFill/>
+                    </a:ln>
+                  </pic:spPr>
+                </pic:pic>
+              </a:graphicData>
+            </a:graphic>
+          </wp:inline>
+        </w:drawing>
+      </w:r>
+    </w:p>
+    <w:p/>
+    <w:p>
+      <w:r>
+        <w:br w:type="page"/>
+      </w:r>
+    </w:p>
+    <w:p>
+      <w:pPr>
+        <w:pStyle w:val="Cmsor2"/>
+      </w:pPr>
+      <w:bookmarkStart w:id="18" w:name="_Toc225791700"/>
+      <w:r>
+        <w:lastRenderedPageBreak/>
+        <w:t>Algoritmusok</w:t>
+      </w:r>
+      <w:bookmarkEnd w:id="18"/>
+    </w:p>
+    <w:p>
+      <w:pPr>
+        <w:rPr>
+          <w:rFonts w:asciiTheme="majorHAnsi" w:eastAsiaTheme="majorEastAsia" w:hAnsiTheme="majorHAnsi" w:cstheme="majorBidi"/>
+          <w:color w:val="0F4761" w:themeColor="accent1" w:themeShade="BF"/>
+          <w:sz w:val="32"/>
+          <w:szCs w:val="32"/>
+        </w:rPr>
+      </w:pPr>
+      <w:r>
+        <w:br w:type="page"/>
+      </w:r>
+    </w:p>
+    <w:p>
+      <w:pPr>
+        <w:pStyle w:val="Cmsor2"/>
+      </w:pPr>
+      <w:bookmarkStart w:id="19" w:name="_Toc225791701"/>
+      <w:r>
+        <w:lastRenderedPageBreak/>
+        <w:t>Tesztelés</w:t>
+      </w:r>
+      <w:bookmarkEnd w:id="19"/>
+    </w:p>
+    <w:p>
+      <w:pPr>
+        <w:rPr>
+          <w:rFonts w:asciiTheme="majorHAnsi" w:eastAsiaTheme="majorEastAsia" w:hAnsiTheme="majorHAnsi" w:cstheme="majorBidi"/>
+          <w:color w:val="0F4761" w:themeColor="accent1" w:themeShade="BF"/>
+          <w:sz w:val="32"/>
+          <w:szCs w:val="32"/>
+        </w:rPr>
+      </w:pPr>
+      <w:r>
+        <w:br w:type="page"/>
+      </w:r>
+    </w:p>
+    <w:p>
+      <w:pPr>
+        <w:pStyle w:val="Cmsor2"/>
+      </w:pPr>
+      <w:bookmarkStart w:id="20" w:name="_Toc225791702"/>
+      <w:r>
+        <w:lastRenderedPageBreak/>
+        <w:t>Fejlesztési lehetőségek</w:t>
+      </w:r>
+      <w:bookmarkEnd w:id="20"/>
+    </w:p>
+    <w:p>
+      <w:pPr>
+        <w:pStyle w:val="Cmsor2"/>
+      </w:pPr>
+      <w:bookmarkStart w:id="21" w:name="_Toc225791703"/>
+      <w:r>
+        <w:t>Képe</w:t>
+      </w:r>
+      <w:r>
+        <w:t>k</w:t>
+      </w:r>
+      <w:r>
+        <w:t xml:space="preserve"> föltöltése</w:t>
+      </w:r>
+      <w:bookmarkEnd w:id="21"/>
+    </w:p>
+    <w:p>
+      <w:pPr>
+        <w:ind w:left="360"/>
+        <w:jc w:val="both"/>
+      </w:pPr>
+      <w:r>
+        <w:t xml:space="preserve">Jelenleg </w:t>
+      </w:r>
+      <w:r>
+        <w:t xml:space="preserve">a felhasználók még nem tudnak </w:t>
+      </w:r>
+      <w:r>
+        <w:t>képek föltölt</w:t>
+      </w:r>
+      <w:r>
+        <w:t>eni</w:t>
+      </w:r>
+      <w:r>
+        <w:t xml:space="preserve"> a Discussion oldalon</w:t>
+      </w:r>
+      <w:r>
+        <w:t>. Célunk, hogy ezt a funkciót minél hamarabb elérhetővé tegyük, ezzel is gazdagítva a beszélgetési élményt, és lehetőséget adva a vizuális tartalmak megosztására.</w:t>
+      </w:r>
+    </w:p>
+    <w:p>
+      <w:pPr>
+        <w:pStyle w:val="Cmsor2"/>
+      </w:pPr>
+      <w:bookmarkStart w:id="22" w:name="_Toc225791704"/>
+      <w:r>
+        <w:t>Apple Music</w:t>
+      </w:r>
+      <w:bookmarkEnd w:id="22"/>
+    </w:p>
+    <w:p>
+      <w:pPr>
+        <w:ind w:left="270"/>
+        <w:jc w:val="both"/>
+      </w:pPr>
+      <w:r>
+        <w:t>Tervezzük, hogy a jövőben az Apple Music felhasználók is csatlakoztathassák fiókjukat a platformhoz. Ezáltal a</w:t>
+      </w:r>
+      <w:r>
+        <w:t xml:space="preserve"> </w:t>
+      </w:r>
       <w:r>
         <w:t>Beatwave</w:t>
       </w:r>
-      <w:proofErr w:type="spellEnd"/>
-      <w:r>
-        <w:t xml:space="preserve"> nemcsak adatvizualizációs eszköz, hanem </w:t>
-      </w:r>
-      <w:r>
+      <w:r>
+        <w:t xml:space="preserve"> </w:t>
+      </w:r>
+      <w:r>
+        <w:t>még szélesebb körben tudná kiszolgálni a zenehallgatók igényeit, és több platformról gyűjthetőek lennének zenei adatok.</w:t>
+      </w:r>
+    </w:p>
+    <w:p>
+      <w:pPr>
+        <w:pStyle w:val="Cmsor2"/>
+      </w:pPr>
+      <w:bookmarkStart w:id="23" w:name="_Toc225791705"/>
+      <w:r>
+        <w:t>Alkalmazás készítése</w:t>
+      </w:r>
+      <w:bookmarkEnd w:id="23"/>
+    </w:p>
+    <w:p>
+      <w:pPr>
+        <w:ind w:left="360"/>
+        <w:jc w:val="both"/>
+      </w:pPr>
+      <w:r>
+        <w:t>Egy dedikált alkalmazás fejlesztése jelentősen megkönnyítené a Beatwave elérését, mivel a felhasználóknak nem kellene kizárólag webes felületen keresztül használniuk a szolgáltatást.</w:t>
+      </w:r>
+    </w:p>
+    <w:p>
+      <w:pPr>
         <w:rPr>
-          <w:b/>
-          <w:bCs/>
+          <w:rFonts w:asciiTheme="majorHAnsi" w:eastAsiaTheme="majorEastAsia" w:hAnsiTheme="majorHAnsi" w:cstheme="majorBidi"/>
+          <w:color w:val="0F4761" w:themeColor="accent1" w:themeShade="BF"/>
+          <w:sz w:val="32"/>
+          <w:szCs w:val="32"/>
         </w:rPr>
-        <w:t>közösségi tér</w:t>
-      </w:r>
-      <w:r>
-        <w:t xml:space="preserve"> is: a felhasználók különböző témájú beszélgetésekben vehetnek részt kedvenc előadóikról, albumokról vagy akár zenei trendekről. A chatfunkció hasonlóan működik, mint az </w:t>
-      </w:r>
-      <w:r>
-        <w:rPr>
-          <w:b/>
-          <w:bCs/>
-        </w:rPr>
-        <w:t xml:space="preserve">Instagram </w:t>
-      </w:r>
-      <w:proofErr w:type="spellStart"/>
-      <w:r>
-        <w:rPr>
-          <w:b/>
-          <w:bCs/>
-        </w:rPr>
-        <w:t>Threads</w:t>
-      </w:r>
-      <w:proofErr w:type="spellEnd"/>
-      <w:r>
-        <w:t xml:space="preserve">, így gyors, interaktív és személyes kommunikációra ad lehetőséget. </w:t>
-      </w:r>
-    </w:p>
-    <w:p>
-      <w:r>
-        <w:t xml:space="preserve">A projekt célja, hogy egyesítse a zenei streaming platformok adatainak elemzését a közösségi élménnyel, ezáltal egy olyan digitális helyet hozzon létre, ahol a zene szerelmesei nemcsak hallgatják, hanem </w:t>
-      </w:r>
-      <w:r>
-        <w:rPr>
-          <w:b/>
-          <w:bCs/>
-        </w:rPr>
-        <w:t>megosztják és megvitatják</w:t>
-      </w:r>
-      <w:r>
-        <w:t xml:space="preserve"> is a zenét, ami inspirálja őket.</w:t>
-      </w:r>
+      </w:pPr>
+      <w:r>
+        <w:br w:type="page"/>
+      </w:r>
+    </w:p>
+    <w:p>
+      <w:pPr>
+        <w:pStyle w:val="Cmsor1"/>
+      </w:pPr>
+      <w:bookmarkStart w:id="24" w:name="_Toc225791706"/>
+      <w:r>
+        <w:lastRenderedPageBreak/>
+        <w:t>Felhasználói dokumentáció</w:t>
+      </w:r>
+      <w:bookmarkEnd w:id="24"/>
+    </w:p>
+    <w:p>
+      <w:pPr>
+        <w:pStyle w:val="Cmsor2"/>
+      </w:pPr>
+      <w:r>
+        <w:t>Projekt áttekintése a felhasználók számára</w:t>
+      </w:r>
+    </w:p>
+    <w:p>
+      <w:pPr>
+        <w:jc w:val="both"/>
+      </w:pPr>
+      <w:r>
+        <w:t>A Beatwave egy modern, zenealapú közösségi platform, amely összekapcsolja a felhasználók zenei ízlését és közösségi élményeit. A platform lehetővé teszi, hogy a Spotify és SoundCloud fiókokból származó adatok alapján megtekintsék leggyakrabban hallgatott zenéiket, előadóikat és zenei műfajaikat egy személyre szabott, esztétikus felületen. A rendszer folyamatosan frissül, így mindig a legaktuálisabb toplistákat mutatja.</w:t>
+      </w:r>
+      <w:r>
+        <w:t xml:space="preserve"> </w:t>
+      </w:r>
+      <w:r>
+        <w:t>Ezen túlmenően a Beatwave közösségi térként is működik, ahol a felhasználók különböző témájú beszélgetésekben oszthatják meg véleményüket kedvenc előadóikról, albumokról vagy zenei trendekről. A chatfunkció gyors, interaktív és személyes kommunikációt tesz lehetővé.</w:t>
+      </w:r>
+    </w:p>
+    <w:p/>
+    <w:p>
+      <w:pPr>
+        <w:pStyle w:val="Cmsor2"/>
+      </w:pPr>
     </w:p>
     <w:sectPr>
+      <w:footerReference w:type="default" r:id="rId10"/>
       <w:pgSz w:w="11906" w:h="16838"/>
       <w:pgMar w:top="1417" w:right="1417" w:bottom="1417" w:left="1417" w:header="708" w:footer="708" w:gutter="0"/>
+      <w:pgNumType w:start="0"/>
       <w:cols w:space="708"/>
+      <w:titlePg/>
       <w:docGrid w:linePitch="360"/>
     </w:sectPr>
   </w:body>
 </w:document>
+</file>
+
+<file path=word/endnotes.xml><?xml version="1.0" encoding="utf-8"?>
+<w:endnotes xmlns:wpc="http://schemas.microsoft.com/office/word/2010/wordprocessingCanvas" xmlns:cx="http://schemas.microsoft.com/office/drawing/2014/chartex" xmlns:cx1="http://schemas.microsoft.com/office/drawing/2015/9/8/chartex" xmlns:cx2="http://schemas.microsoft.com/office/drawing/2015/10/21/chartex" xmlns:cx3="http://schemas.microsoft.com/office/drawing/2016/5/9/chartex" xmlns:cx4="http://schemas.microsoft.com/office/drawing/2016/5/10/chartex" xmlns:cx5="http://schemas.microsoft.com/office/drawing/2016/5/11/chartex" xmlns:cx6="http://schemas.microsoft.com/office/drawing/2016/5/12/chartex" xmlns:cx7="http://schemas.microsoft.com/office/drawing/2016/5/13/chartex" xmlns:cx8="http://schemas.microsoft.com/office/drawing/2016/5/14/chartex" xmlns:mc="http://schemas.openxmlformats.org/markup-compatibility/2006" xmlns:aink="http://schemas.microsoft.com/office/drawing/2016/ink" xmlns:am3d="http://schemas.microsoft.com/office/drawing/2017/model3d" xmlns:o="urn:schemas-microsoft-com:office:office" xmlns:oel="http://schemas.microsoft.com/office/2019/extlst" xmlns:r="http://schemas.openxmlformats.org/officeDocument/2006/relationships" xmlns:m="http://schemas.openxmlformats.org/officeDocument/2006/math" xmlns:v="urn:schemas-microsoft-com:vml" xmlns:wp14="http://schemas.microsoft.com/office/word/2010/wordprocessingDrawing" xmlns:wp="http://schemas.openxmlformats.org/drawingml/2006/wordprocessingDrawing" xmlns:w10="urn:schemas-microsoft-com:office:word" xmlns:w="http://schemas.openxmlformats.org/wordprocessingml/2006/main" xmlns:w14="http://schemas.microsoft.com/office/word/2010/wordml" xmlns:w15="http://schemas.microsoft.com/office/word/2012/wordml" xmlns:w16cex="http://schemas.microsoft.com/office/word/2018/wordml/cex" xmlns:w16cid="http://schemas.microsoft.com/office/word/2016/wordml/cid" xmlns:w16="http://schemas.microsoft.com/office/word/2018/wordml" xmlns:w16du="http://schemas.microsoft.com/office/word/2023/wordml/word16du" xmlns:w16sdtdh="http://schemas.microsoft.com/office/word/2020/wordml/sdtdatahash" xmlns:w16sdtfl="http://schemas.microsoft.com/office/word/2024/wordml/sdtformatlock" xmlns:w16se="http://schemas.microsoft.com/office/word/2015/wordml/symex" xmlns:wpg="http://schemas.microsoft.com/office/word/2010/wordprocessingGroup" xmlns:wpi="http://schemas.microsoft.com/office/word/2010/wordprocessingInk" xmlns:wne="http://schemas.microsoft.com/office/word/2006/wordml" xmlns:wps="http://schemas.microsoft.com/office/word/2010/wordprocessingShape" mc:Ignorable="w14 w15 w16se w16cid w16 w16cex w16sdtdh w16sdtfl w16du wp14">
+  <w:endnote w:type="separator" w:id="-1">
+    <w:p>
+      <w:pPr>
+        <w:spacing w:after="0" w:line="240" w:lineRule="auto"/>
+      </w:pPr>
+      <w:r>
+        <w:separator/>
+      </w:r>
+    </w:p>
+  </w:endnote>
+  <w:endnote w:type="continuationSeparator" w:id="0">
+    <w:p>
+      <w:pPr>
+        <w:spacing w:after="0" w:line="240" w:lineRule="auto"/>
+      </w:pPr>
+      <w:r>
+        <w:continuationSeparator/>
+      </w:r>
+    </w:p>
+  </w:endnote>
+</w:endnotes>
+</file>
+
+<file path=word/footer1.xml><?xml version="1.0" encoding="utf-8"?>
+<w:ftr xmlns:wpc="http://schemas.microsoft.com/office/word/2010/wordprocessingCanvas" xmlns:cx="http://schemas.microsoft.com/office/drawing/2014/chartex" xmlns:cx1="http://schemas.microsoft.com/office/drawing/2015/9/8/chartex" xmlns:cx2="http://schemas.microsoft.com/office/drawing/2015/10/21/chartex" xmlns:cx3="http://schemas.microsoft.com/office/drawing/2016/5/9/chartex" xmlns:cx4="http://schemas.microsoft.com/office/drawing/2016/5/10/chartex" xmlns:cx5="http://schemas.microsoft.com/office/drawing/2016/5/11/chartex" xmlns:cx6="http://schemas.microsoft.com/office/drawing/2016/5/12/chartex" xmlns:cx7="http://schemas.microsoft.com/office/drawing/2016/5/13/chartex" xmlns:cx8="http://schemas.microsoft.com/office/drawing/2016/5/14/chartex" xmlns:mc="http://schemas.openxmlformats.org/markup-compatibility/2006" xmlns:aink="http://schemas.microsoft.com/office/drawing/2016/ink" xmlns:am3d="http://schemas.microsoft.com/office/drawing/2017/model3d" xmlns:o="urn:schemas-microsoft-com:office:office" xmlns:oel="http://schemas.microsoft.com/office/2019/extlst" xmlns:r="http://schemas.openxmlformats.org/officeDocument/2006/relationships" xmlns:m="http://schemas.openxmlformats.org/officeDocument/2006/math" xmlns:v="urn:schemas-microsoft-com:vml" xmlns:wp14="http://schemas.microsoft.com/office/word/2010/wordprocessingDrawing" xmlns:wp="http://schemas.openxmlformats.org/drawingml/2006/wordprocessingDrawing" xmlns:w10="urn:schemas-microsoft-com:office:word" xmlns:w="http://schemas.openxmlformats.org/wordprocessingml/2006/main" xmlns:w14="http://schemas.microsoft.com/office/word/2010/wordml" xmlns:w15="http://schemas.microsoft.com/office/word/2012/wordml" xmlns:w16cex="http://schemas.microsoft.com/office/word/2018/wordml/cex" xmlns:w16cid="http://schemas.microsoft.com/office/word/2016/wordml/cid" xmlns:w16="http://schemas.microsoft.com/office/word/2018/wordml" xmlns:w16du="http://schemas.microsoft.com/office/word/2023/wordml/word16du" xmlns:w16sdtdh="http://schemas.microsoft.com/office/word/2020/wordml/sdtdatahash" xmlns:w16sdtfl="http://schemas.microsoft.com/office/word/2024/wordml/sdtformatlock" xmlns:w16se="http://schemas.microsoft.com/office/word/2015/wordml/symex" xmlns:wpg="http://schemas.microsoft.com/office/word/2010/wordprocessingGroup" xmlns:wpi="http://schemas.microsoft.com/office/word/2010/wordprocessingInk" xmlns:wne="http://schemas.microsoft.com/office/word/2006/wordml" xmlns:wps="http://schemas.microsoft.com/office/word/2010/wordprocessingShape" mc:Ignorable="w14 w15 w16se w16cid w16 w16cex w16sdtdh w16sdtfl w16du wp14">
+  <w:p>
+    <w:pPr>
+      <w:pBdr>
+        <w:left w:val="single" w:sz="12" w:space="11" w:color="156082" w:themeColor="accent1"/>
+      </w:pBdr>
+      <w:tabs>
+        <w:tab w:val="left" w:pos="622"/>
+      </w:tabs>
+      <w:spacing w:after="0"/>
+      <w:rPr>
+        <w:rFonts w:asciiTheme="majorHAnsi" w:eastAsiaTheme="majorEastAsia" w:hAnsiTheme="majorHAnsi" w:cstheme="majorBidi"/>
+        <w:color w:val="0F4761" w:themeColor="accent1" w:themeShade="BF"/>
+        <w:sz w:val="26"/>
+        <w:szCs w:val="26"/>
+      </w:rPr>
+    </w:pPr>
+    <w:r>
+      <w:rPr>
+        <w:rFonts w:asciiTheme="majorHAnsi" w:eastAsiaTheme="majorEastAsia" w:hAnsiTheme="majorHAnsi" w:cstheme="majorBidi"/>
+        <w:color w:val="0F4761" w:themeColor="accent1" w:themeShade="BF"/>
+        <w:sz w:val="26"/>
+        <w:szCs w:val="26"/>
+      </w:rPr>
+      <w:fldChar w:fldCharType="begin"/>
+    </w:r>
+    <w:r>
+      <w:rPr>
+        <w:rFonts w:asciiTheme="majorHAnsi" w:eastAsiaTheme="majorEastAsia" w:hAnsiTheme="majorHAnsi" w:cstheme="majorBidi"/>
+        <w:color w:val="0F4761" w:themeColor="accent1" w:themeShade="BF"/>
+        <w:sz w:val="26"/>
+        <w:szCs w:val="26"/>
+      </w:rPr>
+      <w:instrText>PAGE   \* MERGEFORMAT</w:instrText>
+    </w:r>
+    <w:r>
+      <w:rPr>
+        <w:rFonts w:asciiTheme="majorHAnsi" w:eastAsiaTheme="majorEastAsia" w:hAnsiTheme="majorHAnsi" w:cstheme="majorBidi"/>
+        <w:color w:val="0F4761" w:themeColor="accent1" w:themeShade="BF"/>
+        <w:sz w:val="26"/>
+        <w:szCs w:val="26"/>
+      </w:rPr>
+      <w:fldChar w:fldCharType="separate"/>
+    </w:r>
+    <w:r>
+      <w:rPr>
+        <w:rFonts w:asciiTheme="majorHAnsi" w:eastAsiaTheme="majorEastAsia" w:hAnsiTheme="majorHAnsi" w:cstheme="majorBidi"/>
+        <w:color w:val="0F4761" w:themeColor="accent1" w:themeShade="BF"/>
+        <w:sz w:val="26"/>
+        <w:szCs w:val="26"/>
+      </w:rPr>
+      <w:t>2</w:t>
+    </w:r>
+    <w:r>
+      <w:rPr>
+        <w:rFonts w:asciiTheme="majorHAnsi" w:eastAsiaTheme="majorEastAsia" w:hAnsiTheme="majorHAnsi" w:cstheme="majorBidi"/>
+        <w:color w:val="0F4761" w:themeColor="accent1" w:themeShade="BF"/>
+        <w:sz w:val="26"/>
+        <w:szCs w:val="26"/>
+      </w:rPr>
+      <w:fldChar w:fldCharType="end"/>
+    </w:r>
+  </w:p>
+  <w:p>
+    <w:pPr>
+      <w:pStyle w:val="llb"/>
+    </w:pPr>
+  </w:p>
+</w:ftr>
+</file>
+
+<file path=word/footnotes.xml><?xml version="1.0" encoding="utf-8"?>
+<w:footnotes xmlns:wpc="http://schemas.microsoft.com/office/word/2010/wordprocessingCanvas" xmlns:cx="http://schemas.microsoft.com/office/drawing/2014/chartex" xmlns:cx1="http://schemas.microsoft.com/office/drawing/2015/9/8/chartex" xmlns:cx2="http://schemas.microsoft.com/office/drawing/2015/10/21/chartex" xmlns:cx3="http://schemas.microsoft.com/office/drawing/2016/5/9/chartex" xmlns:cx4="http://schemas.microsoft.com/office/drawing/2016/5/10/chartex" xmlns:cx5="http://schemas.microsoft.com/office/drawing/2016/5/11/chartex" xmlns:cx6="http://schemas.microsoft.com/office/drawing/2016/5/12/chartex" xmlns:cx7="http://schemas.microsoft.com/office/drawing/2016/5/13/chartex" xmlns:cx8="http://schemas.microsoft.com/office/drawing/2016/5/14/chartex" xmlns:mc="http://schemas.openxmlformats.org/markup-compatibility/2006" xmlns:aink="http://schemas.microsoft.com/office/drawing/2016/ink" xmlns:am3d="http://schemas.microsoft.com/office/drawing/2017/model3d" xmlns:o="urn:schemas-microsoft-com:office:office" xmlns:oel="http://schemas.microsoft.com/office/2019/extlst" xmlns:r="http://schemas.openxmlformats.org/officeDocument/2006/relationships" xmlns:m="http://schemas.openxmlformats.org/officeDocument/2006/math" xmlns:v="urn:schemas-microsoft-com:vml" xmlns:wp14="http://schemas.microsoft.com/office/word/2010/wordprocessingDrawing" xmlns:wp="http://schemas.openxmlformats.org/drawingml/2006/wordprocessingDrawing" xmlns:w10="urn:schemas-microsoft-com:office:word" xmlns:w="http://schemas.openxmlformats.org/wordprocessingml/2006/main" xmlns:w14="http://schemas.microsoft.com/office/word/2010/wordml" xmlns:w15="http://schemas.microsoft.com/office/word/2012/wordml" xmlns:w16cex="http://schemas.microsoft.com/office/word/2018/wordml/cex" xmlns:w16cid="http://schemas.microsoft.com/office/word/2016/wordml/cid" xmlns:w16="http://schemas.microsoft.com/office/word/2018/wordml" xmlns:w16du="http://schemas.microsoft.com/office/word/2023/wordml/word16du" xmlns:w16sdtdh="http://schemas.microsoft.com/office/word/2020/wordml/sdtdatahash" xmlns:w16sdtfl="http://schemas.microsoft.com/office/word/2024/wordml/sdtformatlock" xmlns:w16se="http://schemas.microsoft.com/office/word/2015/wordml/symex" xmlns:wpg="http://schemas.microsoft.com/office/word/2010/wordprocessingGroup" xmlns:wpi="http://schemas.microsoft.com/office/word/2010/wordprocessingInk" xmlns:wne="http://schemas.microsoft.com/office/word/2006/wordml" xmlns:wps="http://schemas.microsoft.com/office/word/2010/wordprocessingShape" mc:Ignorable="w14 w15 w16se w16cid w16 w16cex w16sdtdh w16sdtfl w16du wp14">
+  <w:footnote w:type="separator" w:id="-1">
+    <w:p>
+      <w:pPr>
+        <w:spacing w:after="0" w:line="240" w:lineRule="auto"/>
+      </w:pPr>
+      <w:r>
+        <w:separator/>
+      </w:r>
+    </w:p>
+  </w:footnote>
+  <w:footnote w:type="continuationSeparator" w:id="0">
+    <w:p>
+      <w:pPr>
+        <w:spacing w:after="0" w:line="240" w:lineRule="auto"/>
+      </w:pPr>
+      <w:r>
+        <w:continuationSeparator/>
+      </w:r>
+    </w:p>
+  </w:footnote>
+</w:footnotes>
+</file>
+
+<file path=word/numbering.xml><?xml version="1.0" encoding="utf-8"?>
+<w:numbering xmlns:wpc="http://schemas.microsoft.com/office/word/2010/wordprocessingCanvas" xmlns:cx="http://schemas.microsoft.com/office/drawing/2014/chartex" xmlns:cx1="http://schemas.microsoft.com/office/drawing/2015/9/8/chartex" xmlns:cx2="http://schemas.microsoft.com/office/drawing/2015/10/21/chartex" xmlns:cx3="http://schemas.microsoft.com/office/drawing/2016/5/9/chartex" xmlns:cx4="http://schemas.microsoft.com/office/drawing/2016/5/10/chartex" xmlns:cx5="http://schemas.microsoft.com/office/drawing/2016/5/11/chartex" xmlns:cx6="http://schemas.microsoft.com/office/drawing/2016/5/12/chartex" xmlns:cx7="http://schemas.microsoft.com/office/drawing/2016/5/13/chartex" xmlns:cx8="http://schemas.microsoft.com/office/drawing/2016/5/14/chartex" xmlns:mc="http://schemas.openxmlformats.org/markup-compatibility/2006" xmlns:aink="http://schemas.microsoft.com/office/drawing/2016/ink" xmlns:am3d="http://schemas.microsoft.com/office/drawing/2017/model3d" xmlns:o="urn:schemas-microsoft-com:office:office" xmlns:oel="http://schemas.microsoft.com/office/2019/extlst" xmlns:r="http://schemas.openxmlformats.org/officeDocument/2006/relationships" xmlns:m="http://schemas.openxmlformats.org/officeDocument/2006/math" xmlns:v="urn:schemas-microsoft-com:vml" xmlns:wp14="http://schemas.microsoft.com/office/word/2010/wordprocessingDrawing" xmlns:wp="http://schemas.openxmlformats.org/drawingml/2006/wordprocessingDrawing" xmlns:w10="urn:schemas-microsoft-com:office:word" xmlns:w="http://schemas.openxmlformats.org/wordprocessingml/2006/main" xmlns:w14="http://schemas.microsoft.com/office/word/2010/wordml" xmlns:w15="http://schemas.microsoft.com/office/word/2012/wordml" xmlns:w16cex="http://schemas.microsoft.com/office/word/2018/wordml/cex" xmlns:w16cid="http://schemas.microsoft.com/office/word/2016/wordml/cid" xmlns:w16="http://schemas.microsoft.com/office/word/2018/wordml" xmlns:w16du="http://schemas.microsoft.com/office/word/2023/wordml/word16du" xmlns:w16sdtdh="http://schemas.microsoft.com/office/word/2020/wordml/sdtdatahash" xmlns:w16sdtfl="http://schemas.microsoft.com/office/word/2024/wordml/sdtformatlock" xmlns:w16se="http://schemas.microsoft.com/office/word/2015/wordml/symex" xmlns:wpg="http://schemas.microsoft.com/office/word/2010/wordprocessingGroup" xmlns:wpi="http://schemas.microsoft.com/office/word/2010/wordprocessingInk" xmlns:wne="http://schemas.microsoft.com/office/word/2006/wordml" xmlns:wps="http://schemas.microsoft.com/office/word/2010/wordprocessingShape" mc:Ignorable="w14 w15 w16se w16cid w16 w16cex w16sdtdh w16sdtfl w16du wp14">
+  <w:abstractNum w:abstractNumId="0" w15:restartNumberingAfterBreak="0">
+    <w:nsid w:val="6DD84A70"/>
+    <w:multiLevelType w:val="multilevel"/>
+    <w:tmpl w:val="E4367796"/>
+    <w:lvl w:ilvl="0">
+      <w:start w:val="1"/>
+      <w:numFmt w:val="bullet"/>
+      <w:lvlText w:val=""/>
+      <w:lvlJc w:val="left"/>
+      <w:pPr>
+        <w:tabs>
+          <w:tab w:val="num" w:pos="720"/>
+        </w:tabs>
+        <w:ind w:left="720" w:hanging="360"/>
+      </w:pPr>
+      <w:rPr>
+        <w:rFonts w:ascii="Symbol" w:hAnsi="Symbol" w:hint="default"/>
+        <w:sz w:val="20"/>
+      </w:rPr>
+    </w:lvl>
+    <w:lvl w:ilvl="1" w:tentative="1">
+      <w:start w:val="1"/>
+      <w:numFmt w:val="bullet"/>
+      <w:lvlText w:val="o"/>
+      <w:lvlJc w:val="left"/>
+      <w:pPr>
+        <w:tabs>
+          <w:tab w:val="num" w:pos="1440"/>
+        </w:tabs>
+        <w:ind w:left="1440" w:hanging="360"/>
+      </w:pPr>
+      <w:rPr>
+        <w:rFonts w:ascii="Courier New" w:hAnsi="Courier New" w:hint="default"/>
+        <w:sz w:val="20"/>
+      </w:rPr>
+    </w:lvl>
+    <w:lvl w:ilvl="2" w:tentative="1">
+      <w:start w:val="1"/>
+      <w:numFmt w:val="bullet"/>
+      <w:lvlText w:val=""/>
+      <w:lvlJc w:val="left"/>
+      <w:pPr>
+        <w:tabs>
+          <w:tab w:val="num" w:pos="2160"/>
+        </w:tabs>
+        <w:ind w:left="2160" w:hanging="360"/>
+      </w:pPr>
+      <w:rPr>
+        <w:rFonts w:ascii="Wingdings" w:hAnsi="Wingdings" w:hint="default"/>
+        <w:sz w:val="20"/>
+      </w:rPr>
+    </w:lvl>
+    <w:lvl w:ilvl="3" w:tentative="1">
+      <w:start w:val="1"/>
+      <w:numFmt w:val="bullet"/>
+      <w:lvlText w:val=""/>
+      <w:lvlJc w:val="left"/>
+      <w:pPr>
+        <w:tabs>
+          <w:tab w:val="num" w:pos="2880"/>
+        </w:tabs>
+        <w:ind w:left="2880" w:hanging="360"/>
+      </w:pPr>
+      <w:rPr>
+        <w:rFonts w:ascii="Wingdings" w:hAnsi="Wingdings" w:hint="default"/>
+        <w:sz w:val="20"/>
+      </w:rPr>
+    </w:lvl>
+    <w:lvl w:ilvl="4" w:tentative="1">
+      <w:start w:val="1"/>
+      <w:numFmt w:val="bullet"/>
+      <w:lvlText w:val=""/>
+      <w:lvlJc w:val="left"/>
+      <w:pPr>
+        <w:tabs>
+          <w:tab w:val="num" w:pos="3600"/>
+        </w:tabs>
+        <w:ind w:left="3600" w:hanging="360"/>
+      </w:pPr>
+      <w:rPr>
+        <w:rFonts w:ascii="Wingdings" w:hAnsi="Wingdings" w:hint="default"/>
+        <w:sz w:val="20"/>
+      </w:rPr>
+    </w:lvl>
+    <w:lvl w:ilvl="5" w:tentative="1">
+      <w:start w:val="1"/>
+      <w:numFmt w:val="bullet"/>
+      <w:lvlText w:val=""/>
+      <w:lvlJc w:val="left"/>
+      <w:pPr>
+        <w:tabs>
+          <w:tab w:val="num" w:pos="4320"/>
+        </w:tabs>
+        <w:ind w:left="4320" w:hanging="360"/>
+      </w:pPr>
+      <w:rPr>
+        <w:rFonts w:ascii="Wingdings" w:hAnsi="Wingdings" w:hint="default"/>
+        <w:sz w:val="20"/>
+      </w:rPr>
+    </w:lvl>
+    <w:lvl w:ilvl="6" w:tentative="1">
+      <w:start w:val="1"/>
+      <w:numFmt w:val="bullet"/>
+      <w:lvlText w:val=""/>
+      <w:lvlJc w:val="left"/>
+      <w:pPr>
+        <w:tabs>
+          <w:tab w:val="num" w:pos="5040"/>
+        </w:tabs>
+        <w:ind w:left="5040" w:hanging="360"/>
+      </w:pPr>
+      <w:rPr>
+        <w:rFonts w:ascii="Wingdings" w:hAnsi="Wingdings" w:hint="default"/>
+        <w:sz w:val="20"/>
+      </w:rPr>
+    </w:lvl>
+    <w:lvl w:ilvl="7" w:tentative="1">
+      <w:start w:val="1"/>
+      <w:numFmt w:val="bullet"/>
+      <w:lvlText w:val=""/>
+      <w:lvlJc w:val="left"/>
+      <w:pPr>
+        <w:tabs>
+          <w:tab w:val="num" w:pos="5760"/>
+        </w:tabs>
+        <w:ind w:left="5760" w:hanging="360"/>
+      </w:pPr>
+      <w:rPr>
+        <w:rFonts w:ascii="Wingdings" w:hAnsi="Wingdings" w:hint="default"/>
+        <w:sz w:val="20"/>
+      </w:rPr>
+    </w:lvl>
+    <w:lvl w:ilvl="8" w:tentative="1">
+      <w:start w:val="1"/>
+      <w:numFmt w:val="bullet"/>
+      <w:lvlText w:val=""/>
+      <w:lvlJc w:val="left"/>
+      <w:pPr>
+        <w:tabs>
+          <w:tab w:val="num" w:pos="6480"/>
+        </w:tabs>
+        <w:ind w:left="6480" w:hanging="360"/>
+      </w:pPr>
+      <w:rPr>
+        <w:rFonts w:ascii="Wingdings" w:hAnsi="Wingdings" w:hint="default"/>
+        <w:sz w:val="20"/>
+      </w:rPr>
+    </w:lvl>
+  </w:abstractNum>
+  <w:num w:numId="1" w16cid:durableId="360665969">
+    <w:abstractNumId w:val="0"/>
+  </w:num>
+</w:numbering>
 </file>
 
 <file path=word/styles.xml><?xml version="1.0" encoding="utf-8"?>
@@ -568,7 +3511,6 @@
     <w:next w:val="Norml"/>
     <w:link w:val="Cmsor2Char"/>
     <w:uiPriority w:val="9"/>
-    <w:semiHidden/>
     <w:unhideWhenUsed/>
     <w:qFormat/>
     <w:rsid w:val="00AC346C"/>
@@ -591,7 +3533,6 @@
     <w:next w:val="Norml"/>
     <w:link w:val="Cmsor3Char"/>
     <w:uiPriority w:val="9"/>
-    <w:semiHidden/>
     <w:unhideWhenUsed/>
     <w:qFormat/>
     <w:rsid w:val="00AC346C"/>
@@ -614,7 +3555,6 @@
     <w:next w:val="Norml"/>
     <w:link w:val="Cmsor4Char"/>
     <w:uiPriority w:val="9"/>
-    <w:semiHidden/>
     <w:unhideWhenUsed/>
     <w:qFormat/>
     <w:rsid w:val="00AC346C"/>
@@ -637,7 +3577,6 @@
     <w:next w:val="Norml"/>
     <w:link w:val="Cmsor5Char"/>
     <w:uiPriority w:val="9"/>
-    <w:semiHidden/>
     <w:unhideWhenUsed/>
     <w:qFormat/>
     <w:rsid w:val="00AC346C"/>
@@ -784,7 +3723,6 @@
     <w:basedOn w:val="Bekezdsalapbettpusa"/>
     <w:link w:val="Cmsor2"/>
     <w:uiPriority w:val="9"/>
-    <w:semiHidden/>
     <w:rsid w:val="00AC346C"/>
     <w:rPr>
       <w:rFonts w:asciiTheme="majorHAnsi" w:eastAsiaTheme="majorEastAsia" w:hAnsiTheme="majorHAnsi" w:cstheme="majorBidi"/>
@@ -798,7 +3736,6 @@
     <w:basedOn w:val="Bekezdsalapbettpusa"/>
     <w:link w:val="Cmsor3"/>
     <w:uiPriority w:val="9"/>
-    <w:semiHidden/>
     <w:rsid w:val="00AC346C"/>
     <w:rPr>
       <w:rFonts w:eastAsiaTheme="majorEastAsia" w:cstheme="majorBidi"/>
@@ -812,7 +3749,6 @@
     <w:basedOn w:val="Bekezdsalapbettpusa"/>
     <w:link w:val="Cmsor4"/>
     <w:uiPriority w:val="9"/>
-    <w:semiHidden/>
     <w:rsid w:val="00AC346C"/>
     <w:rPr>
       <w:rFonts w:eastAsiaTheme="majorEastAsia" w:cstheme="majorBidi"/>
@@ -826,7 +3762,6 @@
     <w:basedOn w:val="Bekezdsalapbettpusa"/>
     <w:link w:val="Cmsor5"/>
     <w:uiPriority w:val="9"/>
-    <w:semiHidden/>
     <w:rsid w:val="00AC346C"/>
     <w:rPr>
       <w:rFonts w:eastAsiaTheme="majorEastAsia" w:cstheme="majorBidi"/>
@@ -1056,7 +3991,724 @@
       <w:spacing w:val="5"/>
     </w:rPr>
   </w:style>
+  <w:style w:type="paragraph" w:styleId="Nincstrkz">
+    <w:name w:val="No Spacing"/>
+    <w:link w:val="NincstrkzChar"/>
+    <w:uiPriority w:val="1"/>
+    <w:qFormat/>
+    <w:rsid w:val="00E518DD"/>
+    <w:pPr>
+      <w:spacing w:after="0" w:line="240" w:lineRule="auto"/>
+    </w:pPr>
+    <w:rPr>
+      <w:rFonts w:eastAsiaTheme="minorEastAsia"/>
+      <w:kern w:val="0"/>
+      <w:sz w:val="22"/>
+      <w:szCs w:val="22"/>
+      <w:lang w:eastAsia="hu-HU"/>
+      <w14:ligatures w14:val="none"/>
+    </w:rPr>
+  </w:style>
+  <w:style w:type="character" w:customStyle="1" w:styleId="NincstrkzChar">
+    <w:name w:val="Nincs térköz Char"/>
+    <w:basedOn w:val="Bekezdsalapbettpusa"/>
+    <w:link w:val="Nincstrkz"/>
+    <w:uiPriority w:val="1"/>
+    <w:rsid w:val="00E518DD"/>
+    <w:rPr>
+      <w:rFonts w:eastAsiaTheme="minorEastAsia"/>
+      <w:kern w:val="0"/>
+      <w:sz w:val="22"/>
+      <w:szCs w:val="22"/>
+      <w:lang w:eastAsia="hu-HU"/>
+      <w14:ligatures w14:val="none"/>
+    </w:rPr>
+  </w:style>
+  <w:style w:type="paragraph" w:styleId="Tartalomjegyzkcmsora">
+    <w:name w:val="TOC Heading"/>
+    <w:basedOn w:val="Cmsor1"/>
+    <w:next w:val="Norml"/>
+    <w:uiPriority w:val="39"/>
+    <w:unhideWhenUsed/>
+    <w:qFormat/>
+    <w:rsid w:val="00F0620B"/>
+    <w:pPr>
+      <w:spacing w:before="240" w:after="0" w:line="259" w:lineRule="auto"/>
+      <w:outlineLvl w:val="9"/>
+    </w:pPr>
+    <w:rPr>
+      <w:kern w:val="0"/>
+      <w:sz w:val="32"/>
+      <w:szCs w:val="32"/>
+      <w:lang w:eastAsia="hu-HU"/>
+    </w:rPr>
+  </w:style>
+  <w:style w:type="paragraph" w:styleId="TJ1">
+    <w:name w:val="toc 1"/>
+    <w:basedOn w:val="Norml"/>
+    <w:next w:val="Norml"/>
+    <w:autoRedefine/>
+    <w:uiPriority w:val="39"/>
+    <w:unhideWhenUsed/>
+    <w:rsid w:val="00F0620B"/>
+    <w:pPr>
+      <w:spacing w:after="100"/>
+    </w:pPr>
+  </w:style>
+  <w:style w:type="character" w:styleId="Hiperhivatkozs">
+    <w:name w:val="Hyperlink"/>
+    <w:basedOn w:val="Bekezdsalapbettpusa"/>
+    <w:uiPriority w:val="99"/>
+    <w:unhideWhenUsed/>
+    <w:rsid w:val="00F0620B"/>
+    <w:rPr>
+      <w:color w:val="467886" w:themeColor="hyperlink"/>
+      <w:u w:val="single"/>
+    </w:rPr>
+  </w:style>
+  <w:style w:type="paragraph" w:styleId="lfej">
+    <w:name w:val="header"/>
+    <w:basedOn w:val="Norml"/>
+    <w:link w:val="lfejChar"/>
+    <w:uiPriority w:val="99"/>
+    <w:unhideWhenUsed/>
+    <w:rsid w:val="00A4614D"/>
+    <w:pPr>
+      <w:tabs>
+        <w:tab w:val="center" w:pos="4536"/>
+        <w:tab w:val="right" w:pos="9072"/>
+      </w:tabs>
+      <w:spacing w:after="0" w:line="240" w:lineRule="auto"/>
+    </w:pPr>
+  </w:style>
+  <w:style w:type="character" w:customStyle="1" w:styleId="lfejChar">
+    <w:name w:val="Élőfej Char"/>
+    <w:basedOn w:val="Bekezdsalapbettpusa"/>
+    <w:link w:val="lfej"/>
+    <w:uiPriority w:val="99"/>
+    <w:rsid w:val="00A4614D"/>
+  </w:style>
+  <w:style w:type="paragraph" w:styleId="llb">
+    <w:name w:val="footer"/>
+    <w:basedOn w:val="Norml"/>
+    <w:link w:val="llbChar"/>
+    <w:uiPriority w:val="99"/>
+    <w:unhideWhenUsed/>
+    <w:rsid w:val="00A4614D"/>
+    <w:pPr>
+      <w:tabs>
+        <w:tab w:val="center" w:pos="4536"/>
+        <w:tab w:val="right" w:pos="9072"/>
+      </w:tabs>
+      <w:spacing w:after="0" w:line="240" w:lineRule="auto"/>
+    </w:pPr>
+  </w:style>
+  <w:style w:type="character" w:customStyle="1" w:styleId="llbChar">
+    <w:name w:val="Élőláb Char"/>
+    <w:basedOn w:val="Bekezdsalapbettpusa"/>
+    <w:link w:val="llb"/>
+    <w:uiPriority w:val="99"/>
+    <w:rsid w:val="00A4614D"/>
+  </w:style>
+  <w:style w:type="paragraph" w:styleId="TJ2">
+    <w:name w:val="toc 2"/>
+    <w:basedOn w:val="Norml"/>
+    <w:next w:val="Norml"/>
+    <w:autoRedefine/>
+    <w:uiPriority w:val="39"/>
+    <w:unhideWhenUsed/>
+    <w:rsid w:val="00227079"/>
+    <w:pPr>
+      <w:spacing w:after="100"/>
+      <w:ind w:left="240"/>
+    </w:pPr>
+  </w:style>
+  <w:style w:type="paragraph" w:styleId="TJ3">
+    <w:name w:val="toc 3"/>
+    <w:basedOn w:val="Norml"/>
+    <w:next w:val="Norml"/>
+    <w:autoRedefine/>
+    <w:uiPriority w:val="39"/>
+    <w:unhideWhenUsed/>
+    <w:rsid w:val="00227079"/>
+    <w:pPr>
+      <w:spacing w:after="100"/>
+      <w:ind w:left="480"/>
+    </w:pPr>
+  </w:style>
 </w:styles>
+</file>
+
+<file path=word/glossary/document.xml><?xml version="1.0" encoding="utf-8"?>
+<w:glossaryDocument xmlns:wpc="http://schemas.microsoft.com/office/word/2010/wordprocessingCanvas" xmlns:cx="http://schemas.microsoft.com/office/drawing/2014/chartex" xmlns:cx1="http://schemas.microsoft.com/office/drawing/2015/9/8/chartex" xmlns:cx2="http://schemas.microsoft.com/office/drawing/2015/10/21/chartex" xmlns:cx3="http://schemas.microsoft.com/office/drawing/2016/5/9/chartex" xmlns:cx4="http://schemas.microsoft.com/office/drawing/2016/5/10/chartex" xmlns:cx5="http://schemas.microsoft.com/office/drawing/2016/5/11/chartex" xmlns:cx6="http://schemas.microsoft.com/office/drawing/2016/5/12/chartex" xmlns:cx7="http://schemas.microsoft.com/office/drawing/2016/5/13/chartex" xmlns:cx8="http://schemas.microsoft.com/office/drawing/2016/5/14/chartex" xmlns:mc="http://schemas.openxmlformats.org/markup-compatibility/2006" xmlns:aink="http://schemas.microsoft.com/office/drawing/2016/ink" xmlns:am3d="http://schemas.microsoft.com/office/drawing/2017/model3d" xmlns:o="urn:schemas-microsoft-com:office:office" xmlns:oel="http://schemas.microsoft.com/office/2019/extlst" xmlns:r="http://schemas.openxmlformats.org/officeDocument/2006/relationships" xmlns:m="http://schemas.openxmlformats.org/officeDocument/2006/math" xmlns:v="urn:schemas-microsoft-com:vml" xmlns:wp14="http://schemas.microsoft.com/office/word/2010/wordprocessingDrawing" xmlns:wp="http://schemas.openxmlformats.org/drawingml/2006/wordprocessingDrawing" xmlns:w10="urn:schemas-microsoft-com:office:word" xmlns:w="http://schemas.openxmlformats.org/wordprocessingml/2006/main" xmlns:w14="http://schemas.microsoft.com/office/word/2010/wordml" xmlns:w15="http://schemas.microsoft.com/office/word/2012/wordml" xmlns:w16cex="http://schemas.microsoft.com/office/word/2018/wordml/cex" xmlns:w16cid="http://schemas.microsoft.com/office/word/2016/wordml/cid" xmlns:w16="http://schemas.microsoft.com/office/word/2018/wordml" xmlns:w16du="http://schemas.microsoft.com/office/word/2023/wordml/word16du" xmlns:w16sdtdh="http://schemas.microsoft.com/office/word/2020/wordml/sdtdatahash" xmlns:w16sdtfl="http://schemas.microsoft.com/office/word/2024/wordml/sdtformatlock" xmlns:w16se="http://schemas.microsoft.com/office/word/2015/wordml/symex" xmlns:wpg="http://schemas.microsoft.com/office/word/2010/wordprocessingGroup" xmlns:wpi="http://schemas.microsoft.com/office/word/2010/wordprocessingInk" xmlns:wne="http://schemas.microsoft.com/office/word/2006/wordml" xmlns:wps="http://schemas.microsoft.com/office/word/2010/wordprocessingShape" mc:Ignorable="w14 w15 w16se w16cid w16 w16cex w16sdtdh w16sdtfl w16du wp14">
+  <w:docParts>
+    <w:docPart>
+      <w:docPartPr>
+        <w:name w:val="6232899E18244AF2B86370339A01C215"/>
+        <w:category>
+          <w:name w:val="Általános"/>
+          <w:gallery w:val="placeholder"/>
+        </w:category>
+        <w:types>
+          <w:type w:val="bbPlcHdr"/>
+        </w:types>
+        <w:behaviors>
+          <w:behavior w:val="content"/>
+        </w:behaviors>
+        <w:guid w:val="{FD2DD0E7-D78A-49A2-AC77-85E9AC9C6DD8}"/>
+      </w:docPartPr>
+      <w:docPartBody>
+        <w:p>
+          <w:pPr>
+            <w:pStyle w:val="6232899E18244AF2B86370339A01C215"/>
+          </w:pPr>
+          <w:r>
+            <w:rPr>
+              <w:color w:val="156082" w:themeColor="accent1"/>
+              <w:sz w:val="28"/>
+              <w:szCs w:val="28"/>
+            </w:rPr>
+            <w:t>[Szerző neve]</w:t>
+          </w:r>
+        </w:p>
+      </w:docPartBody>
+    </w:docPart>
+  </w:docParts>
+</w:glossaryDocument>
+</file>
+
+<file path=word/glossary/fontTable.xml><?xml version="1.0" encoding="utf-8"?>
+<w:fonts xmlns:mc="http://schemas.openxmlformats.org/markup-compatibility/2006" xmlns:r="http://schemas.openxmlformats.org/officeDocument/2006/relationships" xmlns:w="http://schemas.openxmlformats.org/wordprocessingml/2006/main" xmlns:w14="http://schemas.microsoft.com/office/word/2010/wordml" xmlns:w15="http://schemas.microsoft.com/office/word/2012/wordml" xmlns:w16cex="http://schemas.microsoft.com/office/word/2018/wordml/cex" xmlns:w16cid="http://schemas.microsoft.com/office/word/2016/wordml/cid" xmlns:w16="http://schemas.microsoft.com/office/word/2018/wordml" xmlns:w16du="http://schemas.microsoft.com/office/word/2023/wordml/word16du" xmlns:w16sdtdh="http://schemas.microsoft.com/office/word/2020/wordml/sdtdatahash" xmlns:w16sdtfl="http://schemas.microsoft.com/office/word/2024/wordml/sdtformatlock" xmlns:w16se="http://schemas.microsoft.com/office/word/2015/wordml/symex" mc:Ignorable="w14 w15 w16se w16cid w16 w16cex w16sdtdh w16sdtfl w16du">
+  <w:font w:name="Symbol">
+    <w:panose1 w:val="05050102010706020507"/>
+    <w:charset w:val="02"/>
+    <w:family w:val="roman"/>
+    <w:pitch w:val="variable"/>
+    <w:sig w:usb0="00000000" w:usb1="10000000" w:usb2="00000000" w:usb3="00000000" w:csb0="80000000" w:csb1="00000000"/>
+  </w:font>
+  <w:font w:name="Times New Roman">
+    <w:panose1 w:val="02020603050405020304"/>
+    <w:charset w:val="00"/>
+    <w:family w:val="roman"/>
+    <w:pitch w:val="variable"/>
+    <w:sig w:usb0="E0002EFF" w:usb1="C000785B" w:usb2="00000009" w:usb3="00000000" w:csb0="000001FF" w:csb1="00000000"/>
+  </w:font>
+  <w:font w:name="Courier New">
+    <w:panose1 w:val="02070309020205020404"/>
+    <w:charset w:val="EE"/>
+    <w:family w:val="modern"/>
+    <w:pitch w:val="fixed"/>
+    <w:sig w:usb0="E0002EFF" w:usb1="C0007843" w:usb2="00000009" w:usb3="00000000" w:csb0="000001FF" w:csb1="00000000"/>
+  </w:font>
+  <w:font w:name="Wingdings">
+    <w:panose1 w:val="05000000000000000000"/>
+    <w:charset w:val="02"/>
+    <w:family w:val="auto"/>
+    <w:pitch w:val="variable"/>
+    <w:sig w:usb0="00000000" w:usb1="10000000" w:usb2="00000000" w:usb3="00000000" w:csb0="80000000" w:csb1="00000000"/>
+  </w:font>
+  <w:font w:name="Aptos">
+    <w:charset w:val="00"/>
+    <w:family w:val="swiss"/>
+    <w:pitch w:val="variable"/>
+    <w:sig w:usb0="20000287" w:usb1="00000003" w:usb2="00000000" w:usb3="00000000" w:csb0="0000019F" w:csb1="00000000"/>
+  </w:font>
+  <w:font w:name="Aptos Display">
+    <w:charset w:val="00"/>
+    <w:family w:val="swiss"/>
+    <w:pitch w:val="variable"/>
+    <w:sig w:usb0="20000287" w:usb1="00000003" w:usb2="00000000" w:usb3="00000000" w:csb0="0000019F" w:csb1="00000000"/>
+  </w:font>
+</w:fonts>
+</file>
+
+<file path=word/glossary/settings.xml><?xml version="1.0" encoding="utf-8"?>
+<w:settings xmlns:mc="http://schemas.openxmlformats.org/markup-compatibility/2006" xmlns:o="urn:schemas-microsoft-com:office:office" xmlns:r="http://schemas.openxmlformats.org/officeDocument/2006/relationships" xmlns:m="http://schemas.openxmlformats.org/officeDocument/2006/math" xmlns:v="urn:schemas-microsoft-com:vml" xmlns:w10="urn:schemas-microsoft-com:office:word" xmlns:w="http://schemas.openxmlformats.org/wordprocessingml/2006/main" xmlns:w14="http://schemas.microsoft.com/office/word/2010/wordml" xmlns:w15="http://schemas.microsoft.com/office/word/2012/wordml" xmlns:w16cex="http://schemas.microsoft.com/office/word/2018/wordml/cex" xmlns:w16cid="http://schemas.microsoft.com/office/word/2016/wordml/cid" xmlns:w16="http://schemas.microsoft.com/office/word/2018/wordml" xmlns:w16du="http://schemas.microsoft.com/office/word/2023/wordml/word16du" xmlns:w16sdtdh="http://schemas.microsoft.com/office/word/2020/wordml/sdtdatahash" xmlns:w16sdtfl="http://schemas.microsoft.com/office/word/2024/wordml/sdtformatlock" xmlns:w16se="http://schemas.microsoft.com/office/word/2015/wordml/symex" xmlns:sl="http://schemas.openxmlformats.org/schemaLibrary/2006/main" mc:Ignorable="w14 w15 w16se w16cid w16 w16cex w16sdtdh w16sdtfl w16du">
+  <w:view w:val="normal"/>
+  <w:defaultTabStop w:val="708"/>
+  <w:hyphenationZone w:val="425"/>
+  <w:characterSpacingControl w:val="doNotCompress"/>
+  <w:compat>
+    <w:useFELayout/>
+    <w:compatSetting w:name="compatibilityMode" w:uri="http://schemas.microsoft.com/office/word" w:val="15"/>
+    <w:compatSetting w:name="overrideTableStyleFontSizeAndJustification" w:uri="http://schemas.microsoft.com/office/word" w:val="1"/>
+    <w:compatSetting w:name="enableOpenTypeFeatures" w:uri="http://schemas.microsoft.com/office/word" w:val="1"/>
+    <w:compatSetting w:name="doNotFlipMirrorIndents" w:uri="http://schemas.microsoft.com/office/word" w:val="1"/>
+    <w:compatSetting w:name="differentiateMultirowTableHeaders" w:uri="http://schemas.microsoft.com/office/word" w:val="1"/>
+    <w:compatSetting w:name="useWord2013TrackBottomHyphenation" w:uri="http://schemas.microsoft.com/office/word" w:val="0"/>
+  </w:compat>
+  <w:rsids>
+    <w:rsidRoot w:val="009B5686"/>
+    <w:rsid w:val="001256C9"/>
+    <w:rsid w:val="001B10E2"/>
+    <w:rsid w:val="008069E3"/>
+    <w:rsid w:val="008223B9"/>
+    <w:rsid w:val="008B3882"/>
+    <w:rsid w:val="009B5686"/>
+    <w:rsid w:val="00AE2394"/>
+    <w:rsid w:val="00B56736"/>
+  </w:rsids>
+  <m:mathPr>
+    <m:mathFont m:val="Cambria Math"/>
+    <m:brkBin m:val="before"/>
+    <m:brkBinSub m:val="--"/>
+    <m:smallFrac m:val="0"/>
+    <m:dispDef/>
+    <m:lMargin m:val="0"/>
+    <m:rMargin m:val="0"/>
+    <m:defJc m:val="centerGroup"/>
+    <m:wrapIndent m:val="1440"/>
+    <m:intLim m:val="subSup"/>
+    <m:naryLim m:val="undOvr"/>
+  </m:mathPr>
+  <w:themeFontLang w:val="hu-HU"/>
+  <w:clrSchemeMapping w:bg1="light1" w:t1="dark1" w:bg2="light2" w:t2="dark2" w:accent1="accent1" w:accent2="accent2" w:accent3="accent3" w:accent4="accent4" w:accent5="accent5" w:accent6="accent6" w:hyperlink="hyperlink" w:followedHyperlink="followedHyperlink"/>
+  <w:decimalSymbol w:val="."/>
+  <w:listSeparator w:val=","/>
+  <w15:chartTrackingRefBased/>
+</w:settings>
+</file>
+
+<file path=word/glossary/styles.xml><?xml version="1.0" encoding="utf-8"?>
+<w:styles xmlns:mc="http://schemas.openxmlformats.org/markup-compatibility/2006" xmlns:r="http://schemas.openxmlformats.org/officeDocument/2006/relationships" xmlns:w="http://schemas.openxmlformats.org/wordprocessingml/2006/main" xmlns:w14="http://schemas.microsoft.com/office/word/2010/wordml" xmlns:w15="http://schemas.microsoft.com/office/word/2012/wordml" xmlns:w16cex="http://schemas.microsoft.com/office/word/2018/wordml/cex" xmlns:w16cid="http://schemas.microsoft.com/office/word/2016/wordml/cid" xmlns:w16="http://schemas.microsoft.com/office/word/2018/wordml" xmlns:w16du="http://schemas.microsoft.com/office/word/2023/wordml/word16du" xmlns:w16sdtdh="http://schemas.microsoft.com/office/word/2020/wordml/sdtdatahash" xmlns:w16sdtfl="http://schemas.microsoft.com/office/word/2024/wordml/sdtformatlock" xmlns:w16se="http://schemas.microsoft.com/office/word/2015/wordml/symex" mc:Ignorable="w14 w15 w16se w16cid w16 w16cex w16sdtdh w16sdtfl w16du">
+  <w:docDefaults>
+    <w:rPrDefault>
+      <w:rPr>
+        <w:rFonts w:asciiTheme="minorHAnsi" w:eastAsiaTheme="minorEastAsia" w:hAnsiTheme="minorHAnsi" w:cstheme="minorBidi"/>
+        <w:kern w:val="2"/>
+        <w:sz w:val="22"/>
+        <w:szCs w:val="22"/>
+        <w:lang w:val="hu-HU" w:eastAsia="hu-HU" w:bidi="ar-SA"/>
+        <w14:ligatures w14:val="standardContextual"/>
+      </w:rPr>
+    </w:rPrDefault>
+    <w:pPrDefault>
+      <w:pPr>
+        <w:spacing w:after="160" w:line="259" w:lineRule="auto"/>
+      </w:pPr>
+    </w:pPrDefault>
+  </w:docDefaults>
+  <w:latentStyles w:defLockedState="0" w:defUIPriority="99" w:defSemiHidden="0" w:defUnhideWhenUsed="0" w:defQFormat="0" w:count="376">
+    <w:lsdException w:name="Normal" w:uiPriority="0" w:qFormat="1"/>
+    <w:lsdException w:name="heading 1" w:uiPriority="9" w:qFormat="1"/>
+    <w:lsdException w:name="heading 2" w:semiHidden="1" w:uiPriority="9" w:unhideWhenUsed="1" w:qFormat="1"/>
+    <w:lsdException w:name="heading 3" w:semiHidden="1" w:uiPriority="9" w:unhideWhenUsed="1" w:qFormat="1"/>
+    <w:lsdException w:name="heading 4" w:semiHidden="1" w:uiPriority="9" w:unhideWhenUsed="1" w:qFormat="1"/>
+    <w:lsdException w:name="heading 5" w:semiHidden="1" w:uiPriority="9" w:unhideWhenUsed="1" w:qFormat="1"/>
+    <w:lsdException w:name="heading 6" w:semiHidden="1" w:uiPriority="9" w:unhideWhenUsed="1" w:qFormat="1"/>
+    <w:lsdException w:name="heading 7" w:semiHidden="1" w:uiPriority="9" w:unhideWhenUsed="1" w:qFormat="1"/>
+    <w:lsdException w:name="heading 8" w:semiHidden="1" w:uiPriority="9" w:unhideWhenUsed="1" w:qFormat="1"/>
+    <w:lsdException w:name="heading 9" w:semiHidden="1" w:uiPriority="9" w:unhideWhenUsed="1" w:qFormat="1"/>
+    <w:lsdException w:name="index 1" w:semiHidden="1" w:unhideWhenUsed="1"/>
+    <w:lsdException w:name="index 2" w:semiHidden="1" w:unhideWhenUsed="1"/>
+    <w:lsdException w:name="index 3" w:semiHidden="1" w:unhideWhenUsed="1"/>
+    <w:lsdException w:name="index 4" w:semiHidden="1" w:unhideWhenUsed="1"/>
+    <w:lsdException w:name="index 5" w:semiHidden="1" w:unhideWhenUsed="1"/>
+    <w:lsdException w:name="index 6" w:semiHidden="1" w:unhideWhenUsed="1"/>
+    <w:lsdException w:name="index 7" w:semiHidden="1" w:unhideWhenUsed="1"/>
+    <w:lsdException w:name="index 8" w:semiHidden="1" w:unhideWhenUsed="1"/>
+    <w:lsdException w:name="index 9" w:semiHidden="1" w:unhideWhenUsed="1"/>
+    <w:lsdException w:name="toc 1" w:semiHidden="1" w:uiPriority="39" w:unhideWhenUsed="1"/>
+    <w:lsdException w:name="toc 2" w:semiHidden="1" w:uiPriority="39" w:unhideWhenUsed="1"/>
+    <w:lsdException w:name="toc 3" w:semiHidden="1" w:uiPriority="39" w:unhideWhenUsed="1"/>
+    <w:lsdException w:name="toc 4" w:semiHidden="1" w:uiPriority="39" w:unhideWhenUsed="1"/>
+    <w:lsdException w:name="toc 5" w:semiHidden="1" w:uiPriority="39" w:unhideWhenUsed="1"/>
+    <w:lsdException w:name="toc 6" w:semiHidden="1" w:uiPriority="39" w:unhideWhenUsed="1"/>
+    <w:lsdException w:name="toc 7" w:semiHidden="1" w:uiPriority="39" w:unhideWhenUsed="1"/>
+    <w:lsdException w:name="toc 8" w:semiHidden="1" w:uiPriority="39" w:unhideWhenUsed="1"/>
+    <w:lsdException w:name="toc 9" w:semiHidden="1" w:uiPriority="39" w:unhideWhenUsed="1"/>
+    <w:lsdException w:name="Normal Indent" w:semiHidden="1" w:unhideWhenUsed="1"/>
+    <w:lsdException w:name="footnote text" w:semiHidden="1" w:unhideWhenUsed="1"/>
+    <w:lsdException w:name="annotation text" w:semiHidden="1" w:unhideWhenUsed="1"/>
+    <w:lsdException w:name="header" w:semiHidden="1" w:unhideWhenUsed="1"/>
+    <w:lsdException w:name="footer" w:semiHidden="1" w:unhideWhenUsed="1"/>
+    <w:lsdException w:name="index heading" w:semiHidden="1" w:unhideWhenUsed="1"/>
+    <w:lsdException w:name="caption" w:semiHidden="1" w:uiPriority="35" w:unhideWhenUsed="1" w:qFormat="1"/>
+    <w:lsdException w:name="table of figures" w:semiHidden="1" w:unhideWhenUsed="1"/>
+    <w:lsdException w:name="envelope address" w:semiHidden="1" w:unhideWhenUsed="1"/>
+    <w:lsdException w:name="envelope return" w:semiHidden="1" w:unhideWhenUsed="1"/>
+    <w:lsdException w:name="footnote reference" w:semiHidden="1" w:unhideWhenUsed="1"/>
+    <w:lsdException w:name="annotation reference" w:semiHidden="1" w:unhideWhenUsed="1"/>
+    <w:lsdException w:name="line number" w:semiHidden="1" w:unhideWhenUsed="1"/>
+    <w:lsdException w:name="page number" w:semiHidden="1" w:unhideWhenUsed="1"/>
+    <w:lsdException w:name="endnote reference" w:semiHidden="1" w:unhideWhenUsed="1"/>
+    <w:lsdException w:name="endnote text" w:semiHidden="1" w:unhideWhenUsed="1"/>
+    <w:lsdException w:name="table of authorities" w:semiHidden="1" w:unhideWhenUsed="1"/>
+    <w:lsdException w:name="macro" w:semiHidden="1" w:unhideWhenUsed="1"/>
+    <w:lsdException w:name="toa heading" w:semiHidden="1" w:unhideWhenUsed="1"/>
+    <w:lsdException w:name="List" w:semiHidden="1" w:unhideWhenUsed="1"/>
+    <w:lsdException w:name="List Bullet" w:semiHidden="1" w:unhideWhenUsed="1"/>
+    <w:lsdException w:name="List Number" w:semiHidden="1" w:unhideWhenUsed="1"/>
+    <w:lsdException w:name="List 2" w:semiHidden="1" w:unhideWhenUsed="1"/>
+    <w:lsdException w:name="List 3" w:semiHidden="1" w:unhideWhenUsed="1"/>
+    <w:lsdException w:name="List 4" w:semiHidden="1" w:unhideWhenUsed="1"/>
+    <w:lsdException w:name="List 5" w:semiHidden="1" w:unhideWhenUsed="1"/>
+    <w:lsdException w:name="List Bullet 2" w:semiHidden="1" w:unhideWhenUsed="1"/>
+    <w:lsdException w:name="List Bullet 3" w:semiHidden="1" w:unhideWhenUsed="1"/>
+    <w:lsdException w:name="List Bullet 4" w:semiHidden="1" w:unhideWhenUsed="1"/>
+    <w:lsdException w:name="List Bullet 5" w:semiHidden="1" w:unhideWhenUsed="1"/>
+    <w:lsdException w:name="List Number 2" w:semiHidden="1" w:unhideWhenUsed="1"/>
+    <w:lsdException w:name="List Number 3" w:semiHidden="1" w:unhideWhenUsed="1"/>
+    <w:lsdException w:name="List Number 4" w:semiHidden="1" w:unhideWhenUsed="1"/>
+    <w:lsdException w:name="List Number 5" w:semiHidden="1" w:unhideWhenUsed="1"/>
+    <w:lsdException w:name="Title" w:uiPriority="10" w:qFormat="1"/>
+    <w:lsdException w:name="Closing" w:semiHidden="1" w:unhideWhenUsed="1"/>
+    <w:lsdException w:name="Signature" w:semiHidden="1" w:unhideWhenUsed="1"/>
+    <w:lsdException w:name="Default Paragraph Font" w:semiHidden="1" w:uiPriority="1" w:unhideWhenUsed="1"/>
+    <w:lsdException w:name="Body Text" w:semiHidden="1" w:unhideWhenUsed="1"/>
+    <w:lsdException w:name="Body Text Indent" w:semiHidden="1" w:unhideWhenUsed="1"/>
+    <w:lsdException w:name="List Continue" w:semiHidden="1" w:unhideWhenUsed="1"/>
+    <w:lsdException w:name="List Continue 2" w:semiHidden="1" w:unhideWhenUsed="1"/>
+    <w:lsdException w:name="List Continue 3" w:semiHidden="1" w:unhideWhenUsed="1"/>
+    <w:lsdException w:name="List Continue 4" w:semiHidden="1" w:unhideWhenUsed="1"/>
+    <w:lsdException w:name="List Continue 5" w:semiHidden="1" w:unhideWhenUsed="1"/>
+    <w:lsdException w:name="Message Header" w:semiHidden="1" w:unhideWhenUsed="1"/>
+    <w:lsdException w:name="Subtitle" w:uiPriority="11" w:qFormat="1"/>
+    <w:lsdException w:name="Salutation" w:semiHidden="1" w:unhideWhenUsed="1"/>
+    <w:lsdException w:name="Date" w:semiHidden="1" w:unhideWhenUsed="1"/>
+    <w:lsdException w:name="Body Text First Indent" w:semiHidden="1" w:unhideWhenUsed="1"/>
+    <w:lsdException w:name="Body Text First Indent 2" w:semiHidden="1" w:unhideWhenUsed="1"/>
+    <w:lsdException w:name="Note Heading" w:semiHidden="1" w:unhideWhenUsed="1"/>
+    <w:lsdException w:name="Body Text 2" w:semiHidden="1" w:unhideWhenUsed="1"/>
+    <w:lsdException w:name="Body Text 3" w:semiHidden="1" w:unhideWhenUsed="1"/>
+    <w:lsdException w:name="Body Text Indent 2" w:semiHidden="1" w:unhideWhenUsed="1"/>
+    <w:lsdException w:name="Body Text Indent 3" w:semiHidden="1" w:unhideWhenUsed="1"/>
+    <w:lsdException w:name="Block Text" w:semiHidden="1" w:unhideWhenUsed="1"/>
+    <w:lsdException w:name="Hyperlink" w:semiHidden="1" w:unhideWhenUsed="1"/>
+    <w:lsdException w:name="FollowedHyperlink" w:semiHidden="1" w:unhideWhenUsed="1"/>
+    <w:lsdException w:name="Strong" w:uiPriority="22" w:qFormat="1"/>
+    <w:lsdException w:name="Emphasis" w:uiPriority="20" w:qFormat="1"/>
+    <w:lsdException w:name="Document Map" w:semiHidden="1" w:unhideWhenUsed="1"/>
+    <w:lsdException w:name="Plain Text" w:semiHidden="1" w:unhideWhenUsed="1"/>
+    <w:lsdException w:name="E-mail Signature" w:semiHidden="1" w:unhideWhenUsed="1"/>
+    <w:lsdException w:name="HTML Top of Form" w:semiHidden="1" w:unhideWhenUsed="1"/>
+    <w:lsdException w:name="HTML Bottom of Form" w:semiHidden="1" w:unhideWhenUsed="1"/>
+    <w:lsdException w:name="Normal (Web)" w:semiHidden="1" w:unhideWhenUsed="1"/>
+    <w:lsdException w:name="HTML Acronym" w:semiHidden="1" w:unhideWhenUsed="1"/>
+    <w:lsdException w:name="HTML Address" w:semiHidden="1" w:unhideWhenUsed="1"/>
+    <w:lsdException w:name="HTML Cite" w:semiHidden="1" w:unhideWhenUsed="1"/>
+    <w:lsdException w:name="HTML Code" w:semiHidden="1" w:unhideWhenUsed="1"/>
+    <w:lsdException w:name="HTML Definition" w:semiHidden="1" w:unhideWhenUsed="1"/>
+    <w:lsdException w:name="HTML Keyboard" w:semiHidden="1" w:unhideWhenUsed="1"/>
+    <w:lsdException w:name="HTML Preformatted" w:semiHidden="1" w:unhideWhenUsed="1"/>
+    <w:lsdException w:name="HTML Sample" w:semiHidden="1" w:unhideWhenUsed="1"/>
+    <w:lsdException w:name="HTML Typewriter" w:semiHidden="1" w:unhideWhenUsed="1"/>
+    <w:lsdException w:name="HTML Variable" w:semiHidden="1" w:unhideWhenUsed="1"/>
+    <w:lsdException w:name="Normal Table" w:semiHidden="1" w:unhideWhenUsed="1"/>
+    <w:lsdException w:name="annotation subject" w:semiHidden="1" w:unhideWhenUsed="1"/>
+    <w:lsdException w:name="No List" w:semiHidden="1" w:unhideWhenUsed="1"/>
+    <w:lsdException w:name="Outline List 1" w:semiHidden="1" w:unhideWhenUsed="1"/>
+    <w:lsdException w:name="Outline List 2" w:semiHidden="1" w:unhideWhenUsed="1"/>
+    <w:lsdException w:name="Outline List 3" w:semiHidden="1" w:unhideWhenUsed="1"/>
+    <w:lsdException w:name="Table Simple 1" w:semiHidden="1" w:unhideWhenUsed="1"/>
+    <w:lsdException w:name="Table Simple 2" w:semiHidden="1" w:unhideWhenUsed="1"/>
+    <w:lsdException w:name="Table Simple 3" w:semiHidden="1" w:unhideWhenUsed="1"/>
+    <w:lsdException w:name="Table Classic 1" w:semiHidden="1" w:unhideWhenUsed="1"/>
+    <w:lsdException w:name="Table Classic 2" w:semiHidden="1" w:unhideWhenUsed="1"/>
+    <w:lsdException w:name="Table Classic 3" w:semiHidden="1" w:unhideWhenUsed="1"/>
+    <w:lsdException w:name="Table Classic 4" w:semiHidden="1" w:unhideWhenUsed="1"/>
+    <w:lsdException w:name="Table Colorful 1" w:semiHidden="1" w:unhideWhenUsed="1"/>
+    <w:lsdException w:name="Table Colorful 2" w:semiHidden="1" w:unhideWhenUsed="1"/>
+    <w:lsdException w:name="Table Colorful 3" w:semiHidden="1" w:unhideWhenUsed="1"/>
+    <w:lsdException w:name="Table Columns 1" w:semiHidden="1" w:unhideWhenUsed="1"/>
+    <w:lsdException w:name="Table Columns 2" w:semiHidden="1" w:unhideWhenUsed="1"/>
+    <w:lsdException w:name="Table Columns 3" w:semiHidden="1" w:unhideWhenUsed="1"/>
+    <w:lsdException w:name="Table Columns 4" w:semiHidden="1" w:unhideWhenUsed="1"/>
+    <w:lsdException w:name="Table Columns 5" w:semiHidden="1" w:unhideWhenUsed="1"/>
+    <w:lsdException w:name="Table Grid 1" w:semiHidden="1" w:unhideWhenUsed="1"/>
+    <w:lsdException w:name="Table Grid 2" w:semiHidden="1" w:unhideWhenUsed="1"/>
+    <w:lsdException w:name="Table Grid 3" w:semiHidden="1" w:unhideWhenUsed="1"/>
+    <w:lsdException w:name="Table Grid 4" w:semiHidden="1" w:unhideWhenUsed="1"/>
+    <w:lsdException w:name="Table Grid 5" w:semiHidden="1" w:unhideWhenUsed="1"/>
+    <w:lsdException w:name="Table Grid 6" w:semiHidden="1" w:unhideWhenUsed="1"/>
+    <w:lsdException w:name="Table Grid 7" w:semiHidden="1" w:unhideWhenUsed="1"/>
+    <w:lsdException w:name="Table Grid 8" w:semiHidden="1" w:unhideWhenUsed="1"/>
+    <w:lsdException w:name="Table List 1" w:semiHidden="1" w:unhideWhenUsed="1"/>
+    <w:lsdException w:name="Table List 2" w:semiHidden="1" w:unhideWhenUsed="1"/>
+    <w:lsdException w:name="Table List 3" w:semiHidden="1" w:unhideWhenUsed="1"/>
+    <w:lsdException w:name="Table List 4" w:semiHidden="1" w:unhideWhenUsed="1"/>
+    <w:lsdException w:name="Table List 5" w:semiHidden="1" w:unhideWhenUsed="1"/>
+    <w:lsdException w:name="Table List 6" w:semiHidden="1" w:unhideWhenUsed="1"/>
+    <w:lsdException w:name="Table List 7" w:semiHidden="1" w:unhideWhenUsed="1"/>
+    <w:lsdException w:name="Table List 8" w:semiHidden="1" w:unhideWhenUsed="1"/>
+    <w:lsdException w:name="Table 3D effects 1" w:semiHidden="1" w:unhideWhenUsed="1"/>
+    <w:lsdException w:name="Table 3D effects 2" w:semiHidden="1" w:unhideWhenUsed="1"/>
+    <w:lsdException w:name="Table 3D effects 3" w:semiHidden="1" w:unhideWhenUsed="1"/>
+    <w:lsdException w:name="Table Contemporary" w:semiHidden="1" w:unhideWhenUsed="1"/>
+    <w:lsdException w:name="Table Elegant" w:semiHidden="1" w:unhideWhenUsed="1"/>
+    <w:lsdException w:name="Table Professional" w:semiHidden="1" w:unhideWhenUsed="1"/>
+    <w:lsdException w:name="Table Subtle 1" w:semiHidden="1" w:unhideWhenUsed="1"/>
+    <w:lsdException w:name="Table Subtle 2" w:semiHidden="1" w:unhideWhenUsed="1"/>
+    <w:lsdException w:name="Table Web 1" w:semiHidden="1" w:unhideWhenUsed="1"/>
+    <w:lsdException w:name="Table Web 2" w:semiHidden="1" w:unhideWhenUsed="1"/>
+    <w:lsdException w:name="Table Web 3" w:semiHidden="1" w:unhideWhenUsed="1"/>
+    <w:lsdException w:name="Balloon Text" w:semiHidden="1" w:unhideWhenUsed="1"/>
+    <w:lsdException w:name="Table Grid" w:uiPriority="39"/>
+    <w:lsdException w:name="Table Theme" w:semiHidden="1" w:unhideWhenUsed="1"/>
+    <w:lsdException w:name="Placeholder Text" w:semiHidden="1"/>
+    <w:lsdException w:name="No Spacing" w:uiPriority="1" w:qFormat="1"/>
+    <w:lsdException w:name="Light Shading" w:uiPriority="60"/>
+    <w:lsdException w:name="Light List" w:uiPriority="61"/>
+    <w:lsdException w:name="Light Grid" w:uiPriority="62"/>
+    <w:lsdException w:name="Medium Shading 1" w:uiPriority="63"/>
+    <w:lsdException w:name="Medium Shading 2" w:uiPriority="64"/>
+    <w:lsdException w:name="Medium List 1" w:uiPriority="65"/>
+    <w:lsdException w:name="Medium List 2" w:uiPriority="66"/>
+    <w:lsdException w:name="Medium Grid 1" w:uiPriority="67"/>
+    <w:lsdException w:name="Medium Grid 2" w:uiPriority="68"/>
+    <w:lsdException w:name="Medium Grid 3" w:uiPriority="69"/>
+    <w:lsdException w:name="Dark List" w:uiPriority="70"/>
+    <w:lsdException w:name="Colorful Shading" w:uiPriority="71"/>
+    <w:lsdException w:name="Colorful List" w:uiPriority="72"/>
+    <w:lsdException w:name="Colorful Grid" w:uiPriority="73"/>
+    <w:lsdException w:name="Light Shading Accent 1" w:uiPriority="60"/>
+    <w:lsdException w:name="Light List Accent 1" w:uiPriority="61"/>
+    <w:lsdException w:name="Light Grid Accent 1" w:uiPriority="62"/>
+    <w:lsdException w:name="Medium Shading 1 Accent 1" w:uiPriority="63"/>
+    <w:lsdException w:name="Medium Shading 2 Accent 1" w:uiPriority="64"/>
+    <w:lsdException w:name="Medium List 1 Accent 1" w:uiPriority="65"/>
+    <w:lsdException w:name="Revision" w:semiHidden="1"/>
+    <w:lsdException w:name="List Paragraph" w:uiPriority="34" w:qFormat="1"/>
+    <w:lsdException w:name="Quote" w:uiPriority="29" w:qFormat="1"/>
+    <w:lsdException w:name="Intense Quote" w:uiPriority="30" w:qFormat="1"/>
+    <w:lsdException w:name="Medium List 2 Accent 1" w:uiPriority="66"/>
+    <w:lsdException w:name="Medium Grid 1 Accent 1" w:uiPriority="67"/>
+    <w:lsdException w:name="Medium Grid 2 Accent 1" w:uiPriority="68"/>
+    <w:lsdException w:name="Medium Grid 3 Accent 1" w:uiPriority="69"/>
+    <w:lsdException w:name="Dark List Accent 1" w:uiPriority="70"/>
+    <w:lsdException w:name="Colorful Shading Accent 1" w:uiPriority="71"/>
+    <w:lsdException w:name="Colorful List Accent 1" w:uiPriority="72"/>
+    <w:lsdException w:name="Colorful Grid Accent 1" w:uiPriority="73"/>
+    <w:lsdException w:name="Light Shading Accent 2" w:uiPriority="60"/>
+    <w:lsdException w:name="Light List Accent 2" w:uiPriority="61"/>
+    <w:lsdException w:name="Light Grid Accent 2" w:uiPriority="62"/>
+    <w:lsdException w:name="Medium Shading 1 Accent 2" w:uiPriority="63"/>
+    <w:lsdException w:name="Medium Shading 2 Accent 2" w:uiPriority="64"/>
+    <w:lsdException w:name="Medium List 1 Accent 2" w:uiPriority="65"/>
+    <w:lsdException w:name="Medium List 2 Accent 2" w:uiPriority="66"/>
+    <w:lsdException w:name="Medium Grid 1 Accent 2" w:uiPriority="67"/>
+    <w:lsdException w:name="Medium Grid 2 Accent 2" w:uiPriority="68"/>
+    <w:lsdException w:name="Medium Grid 3 Accent 2" w:uiPriority="69"/>
+    <w:lsdException w:name="Dark List Accent 2" w:uiPriority="70"/>
+    <w:lsdException w:name="Colorful Shading Accent 2" w:uiPriority="71"/>
+    <w:lsdException w:name="Colorful List Accent 2" w:uiPriority="72"/>
+    <w:lsdException w:name="Colorful Grid Accent 2" w:uiPriority="73"/>
+    <w:lsdException w:name="Light Shading Accent 3" w:uiPriority="60"/>
+    <w:lsdException w:name="Light List Accent 3" w:uiPriority="61"/>
+    <w:lsdException w:name="Light Grid Accent 3" w:uiPriority="62"/>
+    <w:lsdException w:name="Medium Shading 1 Accent 3" w:uiPriority="63"/>
+    <w:lsdException w:name="Medium Shading 2 Accent 3" w:uiPriority="64"/>
+    <w:lsdException w:name="Medium List 1 Accent 3" w:uiPriority="65"/>
+    <w:lsdException w:name="Medium List 2 Accent 3" w:uiPriority="66"/>
+    <w:lsdException w:name="Medium Grid 1 Accent 3" w:uiPriority="67"/>
+    <w:lsdException w:name="Medium Grid 2 Accent 3" w:uiPriority="68"/>
+    <w:lsdException w:name="Medium Grid 3 Accent 3" w:uiPriority="69"/>
+    <w:lsdException w:name="Dark List Accent 3" w:uiPriority="70"/>
+    <w:lsdException w:name="Colorful Shading Accent 3" w:uiPriority="71"/>
+    <w:lsdException w:name="Colorful List Accent 3" w:uiPriority="72"/>
+    <w:lsdException w:name="Colorful Grid Accent 3" w:uiPriority="73"/>
+    <w:lsdException w:name="Light Shading Accent 4" w:uiPriority="60"/>
+    <w:lsdException w:name="Light List Accent 4" w:uiPriority="61"/>
+    <w:lsdException w:name="Light Grid Accent 4" w:uiPriority="62"/>
+    <w:lsdException w:name="Medium Shading 1 Accent 4" w:uiPriority="63"/>
+    <w:lsdException w:name="Medium Shading 2 Accent 4" w:uiPriority="64"/>
+    <w:lsdException w:name="Medium List 1 Accent 4" w:uiPriority="65"/>
+    <w:lsdException w:name="Medium List 2 Accent 4" w:uiPriority="66"/>
+    <w:lsdException w:name="Medium Grid 1 Accent 4" w:uiPriority="67"/>
+    <w:lsdException w:name="Medium Grid 2 Accent 4" w:uiPriority="68"/>
+    <w:lsdException w:name="Medium Grid 3 Accent 4" w:uiPriority="69"/>
+    <w:lsdException w:name="Dark List Accent 4" w:uiPriority="70"/>
+    <w:lsdException w:name="Colorful Shading Accent 4" w:uiPriority="71"/>
+    <w:lsdException w:name="Colorful List Accent 4" w:uiPriority="72"/>
+    <w:lsdException w:name="Colorful Grid Accent 4" w:uiPriority="73"/>
+    <w:lsdException w:name="Light Shading Accent 5" w:uiPriority="60"/>
+    <w:lsdException w:name="Light List Accent 5" w:uiPriority="61"/>
+    <w:lsdException w:name="Light Grid Accent 5" w:uiPriority="62"/>
+    <w:lsdException w:name="Medium Shading 1 Accent 5" w:uiPriority="63"/>
+    <w:lsdException w:name="Medium Shading 2 Accent 5" w:uiPriority="64"/>
+    <w:lsdException w:name="Medium List 1 Accent 5" w:uiPriority="65"/>
+    <w:lsdException w:name="Medium List 2 Accent 5" w:uiPriority="66"/>
+    <w:lsdException w:name="Medium Grid 1 Accent 5" w:uiPriority="67"/>
+    <w:lsdException w:name="Medium Grid 2 Accent 5" w:uiPriority="68"/>
+    <w:lsdException w:name="Medium Grid 3 Accent 5" w:uiPriority="69"/>
+    <w:lsdException w:name="Dark List Accent 5" w:uiPriority="70"/>
+    <w:lsdException w:name="Colorful Shading Accent 5" w:uiPriority="71"/>
+    <w:lsdException w:name="Colorful List Accent 5" w:uiPriority="72"/>
+    <w:lsdException w:name="Colorful Grid Accent 5" w:uiPriority="73"/>
+    <w:lsdException w:name="Light Shading Accent 6" w:uiPriority="60"/>
+    <w:lsdException w:name="Light List Accent 6" w:uiPriority="61"/>
+    <w:lsdException w:name="Light Grid Accent 6" w:uiPriority="62"/>
+    <w:lsdException w:name="Medium Shading 1 Accent 6" w:uiPriority="63"/>
+    <w:lsdException w:name="Medium Shading 2 Accent 6" w:uiPriority="64"/>
+    <w:lsdException w:name="Medium List 1 Accent 6" w:uiPriority="65"/>
+    <w:lsdException w:name="Medium List 2 Accent 6" w:uiPriority="66"/>
+    <w:lsdException w:name="Medium Grid 1 Accent 6" w:uiPriority="67"/>
+    <w:lsdException w:name="Medium Grid 2 Accent 6" w:uiPriority="68"/>
+    <w:lsdException w:name="Medium Grid 3 Accent 6" w:uiPriority="69"/>
+    <w:lsdException w:name="Dark List Accent 6" w:uiPriority="70"/>
+    <w:lsdException w:name="Colorful Shading Accent 6" w:uiPriority="71"/>
+    <w:lsdException w:name="Colorful List Accent 6" w:uiPriority="72"/>
+    <w:lsdException w:name="Colorful Grid Accent 6" w:uiPriority="73"/>
+    <w:lsdException w:name="Subtle Emphasis" w:uiPriority="19" w:qFormat="1"/>
+    <w:lsdException w:name="Intense Emphasis" w:uiPriority="21" w:qFormat="1"/>
+    <w:lsdException w:name="Subtle Reference" w:uiPriority="31" w:qFormat="1"/>
+    <w:lsdException w:name="Intense Reference" w:uiPriority="32" w:qFormat="1"/>
+    <w:lsdException w:name="Book Title" w:uiPriority="33" w:qFormat="1"/>
+    <w:lsdException w:name="Bibliography" w:semiHidden="1" w:uiPriority="37" w:unhideWhenUsed="1"/>
+    <w:lsdException w:name="TOC Heading" w:semiHidden="1" w:uiPriority="39" w:unhideWhenUsed="1" w:qFormat="1"/>
+    <w:lsdException w:name="Plain Table 1" w:uiPriority="41"/>
+    <w:lsdException w:name="Plain Table 2" w:uiPriority="42"/>
+    <w:lsdException w:name="Plain Table 3" w:uiPriority="43"/>
+    <w:lsdException w:name="Plain Table 4" w:uiPriority="44"/>
+    <w:lsdException w:name="Plain Table 5" w:uiPriority="45"/>
+    <w:lsdException w:name="Grid Table Light" w:uiPriority="40"/>
+    <w:lsdException w:name="Grid Table 1 Light" w:uiPriority="46"/>
+    <w:lsdException w:name="Grid Table 2" w:uiPriority="47"/>
+    <w:lsdException w:name="Grid Table 3" w:uiPriority="48"/>
+    <w:lsdException w:name="Grid Table 4" w:uiPriority="49"/>
+    <w:lsdException w:name="Grid Table 5 Dark" w:uiPriority="50"/>
+    <w:lsdException w:name="Grid Table 6 Colorful" w:uiPriority="51"/>
+    <w:lsdException w:name="Grid Table 7 Colorful" w:uiPriority="52"/>
+    <w:lsdException w:name="Grid Table 1 Light Accent 1" w:uiPriority="46"/>
+    <w:lsdException w:name="Grid Table 2 Accent 1" w:uiPriority="47"/>
+    <w:lsdException w:name="Grid Table 3 Accent 1" w:uiPriority="48"/>
+    <w:lsdException w:name="Grid Table 4 Accent 1" w:uiPriority="49"/>
+    <w:lsdException w:name="Grid Table 5 Dark Accent 1" w:uiPriority="50"/>
+    <w:lsdException w:name="Grid Table 6 Colorful Accent 1" w:uiPriority="51"/>
+    <w:lsdException w:name="Grid Table 7 Colorful Accent 1" w:uiPriority="52"/>
+    <w:lsdException w:name="Grid Table 1 Light Accent 2" w:uiPriority="46"/>
+    <w:lsdException w:name="Grid Table 2 Accent 2" w:uiPriority="47"/>
+    <w:lsdException w:name="Grid Table 3 Accent 2" w:uiPriority="48"/>
+    <w:lsdException w:name="Grid Table 4 Accent 2" w:uiPriority="49"/>
+    <w:lsdException w:name="Grid Table 5 Dark Accent 2" w:uiPriority="50"/>
+    <w:lsdException w:name="Grid Table 6 Colorful Accent 2" w:uiPriority="51"/>
+    <w:lsdException w:name="Grid Table 7 Colorful Accent 2" w:uiPriority="52"/>
+    <w:lsdException w:name="Grid Table 1 Light Accent 3" w:uiPriority="46"/>
+    <w:lsdException w:name="Grid Table 2 Accent 3" w:uiPriority="47"/>
+    <w:lsdException w:name="Grid Table 3 Accent 3" w:uiPriority="48"/>
+    <w:lsdException w:name="Grid Table 4 Accent 3" w:uiPriority="49"/>
+    <w:lsdException w:name="Grid Table 5 Dark Accent 3" w:uiPriority="50"/>
+    <w:lsdException w:name="Grid Table 6 Colorful Accent 3" w:uiPriority="51"/>
+    <w:lsdException w:name="Grid Table 7 Colorful Accent 3" w:uiPriority="52"/>
+    <w:lsdException w:name="Grid Table 1 Light Accent 4" w:uiPriority="46"/>
+    <w:lsdException w:name="Grid Table 2 Accent 4" w:uiPriority="47"/>
+    <w:lsdException w:name="Grid Table 3 Accent 4" w:uiPriority="48"/>
+    <w:lsdException w:name="Grid Table 4 Accent 4" w:uiPriority="49"/>
+    <w:lsdException w:name="Grid Table 5 Dark Accent 4" w:uiPriority="50"/>
+    <w:lsdException w:name="Grid Table 6 Colorful Accent 4" w:uiPriority="51"/>
+    <w:lsdException w:name="Grid Table 7 Colorful Accent 4" w:uiPriority="52"/>
+    <w:lsdException w:name="Grid Table 1 Light Accent 5" w:uiPriority="46"/>
+    <w:lsdException w:name="Grid Table 2 Accent 5" w:uiPriority="47"/>
+    <w:lsdException w:name="Grid Table 3 Accent 5" w:uiPriority="48"/>
+    <w:lsdException w:name="Grid Table 4 Accent 5" w:uiPriority="49"/>
+    <w:lsdException w:name="Grid Table 5 Dark Accent 5" w:uiPriority="50"/>
+    <w:lsdException w:name="Grid Table 6 Colorful Accent 5" w:uiPriority="51"/>
+    <w:lsdException w:name="Grid Table 7 Colorful Accent 5" w:uiPriority="52"/>
+    <w:lsdException w:name="Grid Table 1 Light Accent 6" w:uiPriority="46"/>
+    <w:lsdException w:name="Grid Table 2 Accent 6" w:uiPriority="47"/>
+    <w:lsdException w:name="Grid Table 3 Accent 6" w:uiPriority="48"/>
+    <w:lsdException w:name="Grid Table 4 Accent 6" w:uiPriority="49"/>
+    <w:lsdException w:name="Grid Table 5 Dark Accent 6" w:uiPriority="50"/>
+    <w:lsdException w:name="Grid Table 6 Colorful Accent 6" w:uiPriority="51"/>
+    <w:lsdException w:name="Grid Table 7 Colorful Accent 6" w:uiPriority="52"/>
+    <w:lsdException w:name="List Table 1 Light" w:uiPriority="46"/>
+    <w:lsdException w:name="List Table 2" w:uiPriority="47"/>
+    <w:lsdException w:name="List Table 3" w:uiPriority="48"/>
+    <w:lsdException w:name="List Table 4" w:uiPriority="49"/>
+    <w:lsdException w:name="List Table 5 Dark" w:uiPriority="50"/>
+    <w:lsdException w:name="List Table 6 Colorful" w:uiPriority="51"/>
+    <w:lsdException w:name="List Table 7 Colorful" w:uiPriority="52"/>
+    <w:lsdException w:name="List Table 1 Light Accent 1" w:uiPriority="46"/>
+    <w:lsdException w:name="List Table 2 Accent 1" w:uiPriority="47"/>
+    <w:lsdException w:name="List Table 3 Accent 1" w:uiPriority="48"/>
+    <w:lsdException w:name="List Table 4 Accent 1" w:uiPriority="49"/>
+    <w:lsdException w:name="List Table 5 Dark Accent 1" w:uiPriority="50"/>
+    <w:lsdException w:name="List Table 6 Colorful Accent 1" w:uiPriority="51"/>
+    <w:lsdException w:name="List Table 7 Colorful Accent 1" w:uiPriority="52"/>
+    <w:lsdException w:name="List Table 1 Light Accent 2" w:uiPriority="46"/>
+    <w:lsdException w:name="List Table 2 Accent 2" w:uiPriority="47"/>
+    <w:lsdException w:name="List Table 3 Accent 2" w:uiPriority="48"/>
+    <w:lsdException w:name="List Table 4 Accent 2" w:uiPriority="49"/>
+    <w:lsdException w:name="List Table 5 Dark Accent 2" w:uiPriority="50"/>
+    <w:lsdException w:name="List Table 6 Colorful Accent 2" w:uiPriority="51"/>
+    <w:lsdException w:name="List Table 7 Colorful Accent 2" w:uiPriority="52"/>
+    <w:lsdException w:name="List Table 1 Light Accent 3" w:uiPriority="46"/>
+    <w:lsdException w:name="List Table 2 Accent 3" w:uiPriority="47"/>
+    <w:lsdException w:name="List Table 3 Accent 3" w:uiPriority="48"/>
+    <w:lsdException w:name="List Table 4 Accent 3" w:uiPriority="49"/>
+    <w:lsdException w:name="List Table 5 Dark Accent 3" w:uiPriority="50"/>
+    <w:lsdException w:name="List Table 6 Colorful Accent 3" w:uiPriority="51"/>
+    <w:lsdException w:name="List Table 7 Colorful Accent 3" w:uiPriority="52"/>
+    <w:lsdException w:name="List Table 1 Light Accent 4" w:uiPriority="46"/>
+    <w:lsdException w:name="List Table 2 Accent 4" w:uiPriority="47"/>
+    <w:lsdException w:name="List Table 3 Accent 4" w:uiPriority="48"/>
+    <w:lsdException w:name="List Table 4 Accent 4" w:uiPriority="49"/>
+    <w:lsdException w:name="List Table 5 Dark Accent 4" w:uiPriority="50"/>
+    <w:lsdException w:name="List Table 6 Colorful Accent 4" w:uiPriority="51"/>
+    <w:lsdException w:name="List Table 7 Colorful Accent 4" w:uiPriority="52"/>
+    <w:lsdException w:name="List Table 1 Light Accent 5" w:uiPriority="46"/>
+    <w:lsdException w:name="List Table 2 Accent 5" w:uiPriority="47"/>
+    <w:lsdException w:name="List Table 3 Accent 5" w:uiPriority="48"/>
+    <w:lsdException w:name="List Table 4 Accent 5" w:uiPriority="49"/>
+    <w:lsdException w:name="List Table 5 Dark Accent 5" w:uiPriority="50"/>
+    <w:lsdException w:name="List Table 6 Colorful Accent 5" w:uiPriority="51"/>
+    <w:lsdException w:name="List Table 7 Colorful Accent 5" w:uiPriority="52"/>
+    <w:lsdException w:name="List Table 1 Light Accent 6" w:uiPriority="46"/>
+    <w:lsdException w:name="List Table 2 Accent 6" w:uiPriority="47"/>
+    <w:lsdException w:name="List Table 3 Accent 6" w:uiPriority="48"/>
+    <w:lsdException w:name="List Table 4 Accent 6" w:uiPriority="49"/>
+    <w:lsdException w:name="List Table 5 Dark Accent 6" w:uiPriority="50"/>
+    <w:lsdException w:name="List Table 6 Colorful Accent 6" w:uiPriority="51"/>
+    <w:lsdException w:name="List Table 7 Colorful Accent 6" w:uiPriority="52"/>
+    <w:lsdException w:name="Mention" w:semiHidden="1" w:unhideWhenUsed="1"/>
+    <w:lsdException w:name="Smart Hyperlink" w:semiHidden="1" w:unhideWhenUsed="1"/>
+    <w:lsdException w:name="Hashtag" w:semiHidden="1" w:unhideWhenUsed="1"/>
+    <w:lsdException w:name="Unresolved Mention" w:semiHidden="1" w:unhideWhenUsed="1"/>
+    <w:lsdException w:name="Smart Link" w:semiHidden="1" w:unhideWhenUsed="1"/>
+  </w:latentStyles>
+  <w:style w:type="paragraph" w:default="1" w:styleId="Norml">
+    <w:name w:val="Normal"/>
+    <w:qFormat/>
+  </w:style>
+  <w:style w:type="character" w:default="1" w:styleId="Bekezdsalapbettpusa">
+    <w:name w:val="Default Paragraph Font"/>
+    <w:uiPriority w:val="1"/>
+    <w:semiHidden/>
+    <w:unhideWhenUsed/>
+  </w:style>
+  <w:style w:type="table" w:default="1" w:styleId="Normltblzat">
+    <w:name w:val="Normal Table"/>
+    <w:uiPriority w:val="99"/>
+    <w:semiHidden/>
+    <w:unhideWhenUsed/>
+    <w:tblPr>
+      <w:tblInd w:w="0" w:type="dxa"/>
+      <w:tblCellMar>
+        <w:top w:w="0" w:type="dxa"/>
+        <w:left w:w="108" w:type="dxa"/>
+        <w:bottom w:w="0" w:type="dxa"/>
+        <w:right w:w="108" w:type="dxa"/>
+      </w:tblCellMar>
+    </w:tblPr>
+  </w:style>
+  <w:style w:type="numbering" w:default="1" w:styleId="Nemlista">
+    <w:name w:val="No List"/>
+    <w:uiPriority w:val="99"/>
+    <w:semiHidden/>
+    <w:unhideWhenUsed/>
+  </w:style>
+  <w:style w:type="paragraph" w:customStyle="1" w:styleId="6232899E18244AF2B86370339A01C215">
+    <w:name w:val="6232899E18244AF2B86370339A01C215"/>
+    <w:rsid w:val="009B5686"/>
+  </w:style>
+</w:styles>
+</file>
+
+<file path=word/glossary/webSettings.xml><?xml version="1.0" encoding="utf-8"?>
+<w:webSettings xmlns:mc="http://schemas.openxmlformats.org/markup-compatibility/2006" xmlns:r="http://schemas.openxmlformats.org/officeDocument/2006/relationships" xmlns:w="http://schemas.openxmlformats.org/wordprocessingml/2006/main" xmlns:w14="http://schemas.microsoft.com/office/word/2010/wordml" xmlns:w15="http://schemas.microsoft.com/office/word/2012/wordml" xmlns:w16cex="http://schemas.microsoft.com/office/word/2018/wordml/cex" xmlns:w16cid="http://schemas.microsoft.com/office/word/2016/wordml/cid" xmlns:w16="http://schemas.microsoft.com/office/word/2018/wordml" xmlns:w16du="http://schemas.microsoft.com/office/word/2023/wordml/word16du" xmlns:w16sdtdh="http://schemas.microsoft.com/office/word/2020/wordml/sdtdatahash" xmlns:w16sdtfl="http://schemas.microsoft.com/office/word/2024/wordml/sdtformatlock" xmlns:w16se="http://schemas.microsoft.com/office/word/2015/wordml/symex" mc:Ignorable="w14 w15 w16se w16cid w16 w16cex w16sdtdh w16sdtfl w16du">
+  <w:optimizeForBrowser/>
+  <w:allowPNG/>
+</w:webSettings>
 </file>
 
 <file path=word/theme/theme1.xml><?xml version="1.0" encoding="utf-8"?>
@@ -1372,4 +5024,16 @@
     </a:ext>
   </a:extLst>
 </a:theme>
+</file>
+
+<file path=customXml/item1.xml><?xml version="1.0" encoding="utf-8"?>
+<b:Sources xmlns:b="http://schemas.openxmlformats.org/officeDocument/2006/bibliography" xmlns="http://schemas.openxmlformats.org/officeDocument/2006/bibliography" SelectedStyle="\APASixthEditionOfficeOnline.xsl" StyleName="APA" Version="6"/>
+</file>
+
+<file path=customXml/itemProps1.xml><?xml version="1.0" encoding="utf-8"?>
+<ds:datastoreItem xmlns:ds="http://schemas.openxmlformats.org/officeDocument/2006/customXml" ds:itemID="{FB79A995-5A5E-4C3F-BCC4-3E8C0037EAD0}">
+  <ds:schemaRefs>
+    <ds:schemaRef ds:uri="http://schemas.openxmlformats.org/officeDocument/2006/bibliography"/>
+  </ds:schemaRefs>
+</ds:datastoreItem>
 </file>
</xml_diff>